<commit_message>
docs: regenerate Froglips-User-Guide.docx for v0.7.2
Mirrors the updated USER_GUIDE.md content — three backends including
Native, 10 agent tools (multi_edit / git_status / git_diff added),
tool-history panel, conversation search + export, themes, keyboard
shortcuts, Metal Toolchain troubleshooting.
</commit_message>
<xml_diff>
--- a/docs/Froglips-User-Guide.docx
+++ b/docs/Froglips-User-Guide.docx
@@ -35,7 +35,6 @@
     </w:p>
     <w:p>
       <w:pPr>
-        <w:spacing w:after="120" w:before="240"/>
         <w:jc w:val="center"/>
       </w:pPr>
       <w:r>
@@ -43,12 +42,12 @@
           <w:sz w:val="28"/>
           <w:szCs w:val="28"/>
         </w:rPr>
-        <w:t xml:space="preserve">Version 0.4.0</w:t>
-      </w:r>
-    </w:p>
-    <w:p>
-      <w:pPr>
-        <w:spacing w:after="240" w:before="0"/>
+        <w:t xml:space="preserve">Version 0.7.2</w:t>
+      </w:r>
+    </w:p>
+    <w:p>
+      <w:pPr>
+        <w:spacing w:after="240"/>
         <w:jc w:val="center"/>
       </w:pPr>
       <w:r>
@@ -74,7 +73,7 @@
           <w:sz w:val="22"/>
           <w:szCs w:val="22"/>
         </w:rPr>
-        <w:t xml:space="preserve">Native macOS chat app for local LLMs — MLX + Ollama backends, agent mode with filesystem and shell tools, vector-recall memory, signed auto-updates.</w:t>
+        <w:t xml:space="preserve">Native macOS chat for local LLMs — three backends (MLX, Ollama, Native mistralrs+Metal), agent mode with filesystem and shell tools, vector-recall memory, signed auto-updates.</w:t>
       </w:r>
     </w:p>
     <w:p>
@@ -107,7 +106,7 @@
         </w:numPr>
       </w:pPr>
       <w:r>
-        <w:t xml:space="preserve">Download Froglips_0.4.0_aarch64.dmg from the GitHub Releases page.</w:t>
+        <w:t xml:space="preserve">Download Froglips_0.7.2_aarch64.dmg from the GitHub Releases page.</w:t>
       </w:r>
     </w:p>
     <w:p>
@@ -193,7 +192,7 @@
     </w:p>
     <w:p>
       <w:r>
-        <w:t xml:space="preserve">Froglips uses one or both of these backends. You can install only what you need.</w:t>
+        <w:t xml:space="preserve">Froglips has three backends — install whichever you want:</w:t>
       </w:r>
     </w:p>
     <w:p>
@@ -245,7 +244,7 @@
         <w:pStyle w:val="Heading2"/>
       </w:pPr>
       <w:r>
-        <w:t xml:space="preserve">MLX (Apple's Metal-accelerated local inference)</w:t>
+        <w:t xml:space="preserve">MLX (Apple's Metal-accelerated local inference, via subprocess)</w:t>
       </w:r>
     </w:p>
     <w:p>
@@ -266,6 +265,24 @@
     <w:p>
       <w:r>
         <w:t xml:space="preserve">Froglips spawns mlx_lm.server automatically when you pick an MLX model.</w:t>
+      </w:r>
+    </w:p>
+    <w:p>
+      <w:pPr>
+        <w:pStyle w:val="Heading2"/>
+      </w:pPr>
+      <w:r>
+        <w:t xml:space="preserve">Native (in-process, no daemon, no Python)</w:t>
+      </w:r>
+    </w:p>
+    <w:p>
+      <w:r>
+        <w:t xml:space="preserve">Nothing to install — Froglips loads models directly via mistralrs + candle + Metal kernels embedded in the app binary. First-time model use downloads weights from HuggingFace into ~/.cache/huggingface/hub. Lowest per-token latency of the three backends.</w:t>
+      </w:r>
+    </w:p>
+    <w:p>
+      <w:r>
+        <w:t xml:space="preserve">Pick “⚡ Load a HuggingFace model natively…” in the model dropdown and enter a repo id (e.g. NousResearch/Llama-3.2-1B).</w:t>
       </w:r>
     </w:p>
     <w:p>
@@ -673,7 +690,7 @@
           </w:tcPr>
           <w:p>
             <w:r>
-              <w:t xml:space="preserve">Live search of civitai.com. Mostly diffusion (image gen) - direct loading not supported, but useful for browsing. Shows ratings, SHA256, file format, license, scan status.</w:t>
+              <w:t xml:space="preserve">Live search of civitai.com. Mostly diffusion (image gen). Shows ratings, SHA256, file format, license, scan status.</w:t>
             </w:r>
           </w:p>
         </w:tc>
@@ -726,7 +743,7 @@
     </w:p>
     <w:p>
       <w:r>
-        <w:t xml:space="preserve">Froglips remembers things across conversations. There are four modes (set via the small (i) button next to the model name):</w:t>
+        <w:t xml:space="preserve">Froglips remembers things across conversations. Four modes (set via the small (i) button next to the model name):</w:t>
       </w:r>
     </w:p>
     <w:tbl>
@@ -937,7 +954,7 @@
           </w:tcPr>
           <w:p>
             <w:r>
-              <w:t xml:space="preserve">Same as manual, plus automatically extracts facts after each turn into a pending queue. You review and approve.</w:t>
+              <w:t xml:space="preserve">Same as manual, plus auto-extracts facts after each turn into a pending queue. You review + approve.</w:t>
             </w:r>
           </w:p>
         </w:tc>
@@ -999,7 +1016,7 @@
     </w:p>
     <w:p>
       <w:r>
-        <w:t xml:space="preserve">Before each turn, Froglips embeds your message using nomic-embed-text (via Ollama), looks for memories with cosine similarity &gt; 0.55, and injects up to 5 into the system prompt as a &lt;memory&gt;...&lt;/memory&gt; block. If vector search returns nothing, it falls back to keyword search.</w:t>
+        <w:t xml:space="preserve">Before each turn, Froglips embeds your message using nomic-embed-text (via Ollama), looks for memories with cosine similarity &gt; 0.55, and injects up to 5 into the system prompt as a &lt;memory&gt;…&lt;/memory&gt; block. If vector search returns nothing, falls back to keyword search.</w:t>
       </w:r>
     </w:p>
     <w:p>
@@ -1012,7 +1029,7 @@
     </w:p>
     <w:p>
       <w:r>
-        <w:t xml:space="preserve">After each turn, Froglips asks a small model (qwen3:4b if installed, else fallbacks) to extract JSON facts from your message + the assistant's reply. Facts are deduped against existing memories at 0.85 cosine before insert. Secrets are auto-rejected: AWS / OpenAI / GitHub / Slack tokens, JWTs, bearer-prefixed strings, labeled hex blobs.</w:t>
+        <w:t xml:space="preserve">After each turn, Froglips asks a small model (qwen3:4b if installed, else fallbacks) to extract JSON facts from the conversation. Facts are deduped against existing memories at 0.85 cosine before insert. Secrets are auto-rejected: AWS / OpenAI / GitHub / Slack tokens, JWTs, bearer-prefixed strings, labeled hex blobs.</w:t>
       </w:r>
     </w:p>
     <w:p>
@@ -1054,7 +1071,7 @@
     </w:p>
     <w:p>
       <w:r>
-        <w:t xml:space="preserve">You can delete, promote pending → active, or add manually.</w:t>
+        <w:t xml:space="preserve">Delete, promote pending → active, or add manually.</w:t>
       </w:r>
     </w:p>
     <w:p>
@@ -1067,12 +1084,12 @@
     </w:p>
     <w:p>
       <w:r>
-        <w:t xml:space="preserve">Toggle the Agent button next to the chat input. Available only with the Ollama backend.</w:t>
-      </w:r>
-    </w:p>
-    <w:p>
-      <w:r>
-        <w:t xml:space="preserve">The agent has direct access to the user's filesystem and shell via 7 tools:</w:t>
+        <w:t xml:space="preserve">Toggle the Agent button next to the chat input. Available only with the Ollama backend (native backend support pending).</w:t>
+      </w:r>
+    </w:p>
+    <w:p>
+      <w:r>
+        <w:t xml:space="preserve">The agent has direct access to the user's filesystem and shell via 10 tools:</w:t>
       </w:r>
     </w:p>
     <w:tbl>
@@ -1191,7 +1208,7 @@
           </w:tcPr>
           <w:p>
             <w:r>
-              <w:t xml:space="preserve">Read file contents (paginated, 64 KB chunks)</w:t>
+              <w:t xml:space="preserve">Read file contents (paginated, 64 KB chunks); non-UTF8 returns {binary: true}</w:t>
             </w:r>
           </w:p>
         </w:tc>
@@ -1283,7 +1300,7 @@
           </w:tcPr>
           <w:p>
             <w:r>
-              <w:t xml:space="preserve">Recursive grep with filename glob (*.ts etc.)</w:t>
+              <w:t xml:space="preserve">Recursive grep with filename glob (*.ts). Set regex=true for Rust regex syntax</w:t>
             </w:r>
           </w:p>
         </w:tc>
@@ -1399,7 +1416,7 @@
           </w:tcPr>
           <w:p>
             <w:r>
-              <w:t xml:space="preserve">write_file</w:t>
+              <w:t xml:space="preserve">multi_edit</w:t>
             </w:r>
           </w:p>
         </w:tc>
@@ -1421,7 +1438,7 @@
           </w:tcPr>
           <w:p>
             <w:r>
-              <w:t xml:space="preserve">Write or overwrite a file (requires approval)</w:t>
+              <w:t xml:space="preserve">Apply multiple find-and-replace edits to one file atomically</w:t>
             </w:r>
           </w:p>
         </w:tc>
@@ -1445,6 +1462,52 @@
           </w:tcPr>
           <w:p>
             <w:r>
+              <w:t xml:space="preserve">write_file</w:t>
+            </w:r>
+          </w:p>
+        </w:tc>
+        <w:tc>
+          <w:tcPr>
+            <w:tcW w:type="dxa" w:w="6960"/>
+            <w:tcBorders>
+              <w:top w:val="single" w:color="CCCCCC" w:sz="4"/>
+              <w:left w:val="single" w:color="CCCCCC" w:sz="4"/>
+              <w:bottom w:val="single" w:color="CCCCCC" w:sz="4"/>
+              <w:right w:val="single" w:color="CCCCCC" w:sz="4"/>
+            </w:tcBorders>
+            <w:tcMar>
+              <w:top w:type="dxa" w:w="80"/>
+              <w:left w:type="dxa" w:w="120"/>
+              <w:bottom w:type="dxa" w:w="80"/>
+              <w:right w:type="dxa" w:w="120"/>
+            </w:tcMar>
+          </w:tcPr>
+          <w:p>
+            <w:r>
+              <w:t xml:space="preserve">Write or overwrite a file (requires approval)</w:t>
+            </w:r>
+          </w:p>
+        </w:tc>
+      </w:tr>
+      <w:tr>
+        <w:tc>
+          <w:tcPr>
+            <w:tcW w:type="dxa" w:w="2400"/>
+            <w:tcBorders>
+              <w:top w:val="single" w:color="CCCCCC" w:sz="4"/>
+              <w:left w:val="single" w:color="CCCCCC" w:sz="4"/>
+              <w:bottom w:val="single" w:color="CCCCCC" w:sz="4"/>
+              <w:right w:val="single" w:color="CCCCCC" w:sz="4"/>
+            </w:tcBorders>
+            <w:tcMar>
+              <w:top w:type="dxa" w:w="80"/>
+              <w:left w:type="dxa" w:w="120"/>
+              <w:bottom w:type="dxa" w:w="80"/>
+              <w:right w:type="dxa" w:w="120"/>
+            </w:tcMar>
+          </w:tcPr>
+          <w:p>
+            <w:r>
               <w:t xml:space="preserve">run_shell</w:t>
             </w:r>
           </w:p>
@@ -1468,6 +1531,98 @@
           <w:p>
             <w:r>
               <w:t xml:space="preserve">Execute via sh -c (requires approval, 30 s timeout)</w:t>
+            </w:r>
+          </w:p>
+        </w:tc>
+      </w:tr>
+      <w:tr>
+        <w:tc>
+          <w:tcPr>
+            <w:tcW w:type="dxa" w:w="2400"/>
+            <w:tcBorders>
+              <w:top w:val="single" w:color="CCCCCC" w:sz="4"/>
+              <w:left w:val="single" w:color="CCCCCC" w:sz="4"/>
+              <w:bottom w:val="single" w:color="CCCCCC" w:sz="4"/>
+              <w:right w:val="single" w:color="CCCCCC" w:sz="4"/>
+            </w:tcBorders>
+            <w:tcMar>
+              <w:top w:type="dxa" w:w="80"/>
+              <w:left w:type="dxa" w:w="120"/>
+              <w:bottom w:type="dxa" w:w="80"/>
+              <w:right w:type="dxa" w:w="120"/>
+            </w:tcMar>
+          </w:tcPr>
+          <w:p>
+            <w:r>
+              <w:t xml:space="preserve">git_status</w:t>
+            </w:r>
+          </w:p>
+        </w:tc>
+        <w:tc>
+          <w:tcPr>
+            <w:tcW w:type="dxa" w:w="6960"/>
+            <w:tcBorders>
+              <w:top w:val="single" w:color="CCCCCC" w:sz="4"/>
+              <w:left w:val="single" w:color="CCCCCC" w:sz="4"/>
+              <w:bottom w:val="single" w:color="CCCCCC" w:sz="4"/>
+              <w:right w:val="single" w:color="CCCCCC" w:sz="4"/>
+            </w:tcBorders>
+            <w:tcMar>
+              <w:top w:type="dxa" w:w="80"/>
+              <w:left w:type="dxa" w:w="120"/>
+              <w:bottom w:type="dxa" w:w="80"/>
+              <w:right w:type="dxa" w:w="120"/>
+            </w:tcMar>
+          </w:tcPr>
+          <w:p>
+            <w:r>
+              <w:t xml:space="preserve">git status --short --branch in workspace or given path</w:t>
+            </w:r>
+          </w:p>
+        </w:tc>
+      </w:tr>
+      <w:tr>
+        <w:tc>
+          <w:tcPr>
+            <w:tcW w:type="dxa" w:w="2400"/>
+            <w:tcBorders>
+              <w:top w:val="single" w:color="CCCCCC" w:sz="4"/>
+              <w:left w:val="single" w:color="CCCCCC" w:sz="4"/>
+              <w:bottom w:val="single" w:color="CCCCCC" w:sz="4"/>
+              <w:right w:val="single" w:color="CCCCCC" w:sz="4"/>
+            </w:tcBorders>
+            <w:tcMar>
+              <w:top w:type="dxa" w:w="80"/>
+              <w:left w:type="dxa" w:w="120"/>
+              <w:bottom w:type="dxa" w:w="80"/>
+              <w:right w:type="dxa" w:w="120"/>
+            </w:tcMar>
+          </w:tcPr>
+          <w:p>
+            <w:r>
+              <w:t xml:space="preserve">git_diff</w:t>
+            </w:r>
+          </w:p>
+        </w:tc>
+        <w:tc>
+          <w:tcPr>
+            <w:tcW w:type="dxa" w:w="6960"/>
+            <w:tcBorders>
+              <w:top w:val="single" w:color="CCCCCC" w:sz="4"/>
+              <w:left w:val="single" w:color="CCCCCC" w:sz="4"/>
+              <w:bottom w:val="single" w:color="CCCCCC" w:sz="4"/>
+              <w:right w:val="single" w:color="CCCCCC" w:sz="4"/>
+            </w:tcBorders>
+            <w:tcMar>
+              <w:top w:type="dxa" w:w="80"/>
+              <w:left w:type="dxa" w:w="120"/>
+              <w:bottom w:type="dxa" w:w="80"/>
+              <w:right w:type="dxa" w:w="120"/>
+            </w:tcMar>
+          </w:tcPr>
+          <w:p>
+            <w:r>
+              <w:t xml:space="preserve">git diff (optional staged=true) in workspace or given path</w:t>
             </w:r>
           </w:p>
         </w:tc>
@@ -1884,7 +2039,7 @@
         </w:numPr>
       </w:pPr>
       <w:r>
-        <w:t xml:space="preserve">Every run_shell, write_file, and edit_file call requires explicit user approval.</w:t>
+        <w:t xml:space="preserve">Every run_shell, write_file, edit_file, and multi_edit call requires explicit user approval.</w:t>
       </w:r>
     </w:p>
     <w:p>
@@ -1896,7 +2051,7 @@
         </w:numPr>
       </w:pPr>
       <w:r>
-        <w:t xml:space="preserve">The confirm dialog shows a destructive / privileged / pipe-from-network badge for risky patterns (e.g. rm -rf /, sudo, curl ... | sh).</w:t>
+        <w:t xml:space="preserve">The confirm dialog shows a destructive / privileged / pipe-from-network badge for risky patterns (rm -rf /, sudo, curl ... | sh).</w:t>
       </w:r>
     </w:p>
     <w:p>
@@ -2046,10 +2201,156 @@
     </w:p>
     <w:p>
       <w:pPr>
+        <w:pStyle w:val="Heading2"/>
+      </w:pPr>
+      <w:r>
+        <w:t xml:space="preserve">Tool history</w:t>
+      </w:r>
+    </w:p>
+    <w:p>
+      <w:r>
+        <w:t xml:space="preserve">Tools button in the agent toolbar opens a slide-out panel listing every tool call in the current conversation with name, ok/err status badge, collapsible args + JSON result. Useful for debugging agent runs.</w:t>
+      </w:r>
+    </w:p>
+    <w:p>
+      <w:pPr>
         <w:pStyle w:val="Heading1"/>
       </w:pPr>
       <w:r>
-        <w:t xml:space="preserve">7. Voice input</w:t>
+        <w:t xml:space="preserve">7. Conversation search + export</w:t>
+      </w:r>
+    </w:p>
+    <w:p>
+      <w:pPr>
+        <w:pStyle w:val="ListParagraph"/>
+        <w:numPr>
+          <w:ilvl w:val="0"/>
+          <w:numId w:val="3"/>
+        </w:numPr>
+      </w:pPr>
+      <w:r>
+        <w:rPr>
+          <w:b/>
+          <w:bCs/>
+        </w:rPr>
+        <w:t xml:space="preserve">Search:</w:t>
+      </w:r>
+      <w:r>
+        <w:t xml:space="preserve"> search input at the top of the sidebar filters conversations by title substring.</w:t>
+      </w:r>
+    </w:p>
+    <w:p>
+      <w:pPr>
+        <w:pStyle w:val="ListParagraph"/>
+        <w:numPr>
+          <w:ilvl w:val="0"/>
+          <w:numId w:val="3"/>
+        </w:numPr>
+      </w:pPr>
+      <w:r>
+        <w:rPr>
+          <w:b/>
+          <w:bCs/>
+        </w:rPr>
+        <w:t xml:space="preserve">Export:</w:t>
+      </w:r>
+      <w:r>
+        <w:t xml:space="preserve"> ↓ Export button in the agent toolbar saves the current conversation as Markdown (timestamps, model tags, tool calls + results included).</w:t>
+      </w:r>
+    </w:p>
+    <w:p>
+      <w:pPr>
+        <w:pStyle w:val="ListParagraph"/>
+        <w:numPr>
+          <w:ilvl w:val="0"/>
+          <w:numId w:val="3"/>
+        </w:numPr>
+      </w:pPr>
+      <w:r>
+        <w:rPr>
+          <w:b/>
+          <w:bCs/>
+        </w:rPr>
+        <w:t xml:space="preserve">Per-message actions:</w:t>
+      </w:r>
+      <w:r>
+        <w:t xml:space="preserve"> hover any message — Copy (clipboard), Regenerate (assistant only, deletes the prior pair and re-asks), Edit (user only, drafts the text back into the input).</w:t>
+      </w:r>
+    </w:p>
+    <w:p>
+      <w:pPr>
+        <w:pStyle w:val="Heading1"/>
+      </w:pPr>
+      <w:r>
+        <w:t xml:space="preserve">8. Themes + keyboard shortcuts</w:t>
+      </w:r>
+    </w:p>
+    <w:p>
+      <w:pPr>
+        <w:pStyle w:val="ListParagraph"/>
+        <w:numPr>
+          <w:ilvl w:val="0"/>
+          <w:numId w:val="3"/>
+        </w:numPr>
+      </w:pPr>
+      <w:r>
+        <w:t xml:space="preserve">Sun/Moon button in sidebar toggles light/dark theme. Persisted across restarts.</w:t>
+      </w:r>
+    </w:p>
+    <w:p>
+      <w:pPr>
+        <w:pStyle w:val="ListParagraph"/>
+        <w:numPr>
+          <w:ilvl w:val="0"/>
+          <w:numId w:val="3"/>
+        </w:numPr>
+      </w:pPr>
+      <w:r>
+        <w:t xml:space="preserve">Markdown rendering: assistant + user messages render Markdown with code-block syntax highlighting for 20+ languages.</w:t>
+      </w:r>
+    </w:p>
+    <w:p>
+      <w:pPr>
+        <w:pStyle w:val="ListParagraph"/>
+        <w:numPr>
+          <w:ilvl w:val="0"/>
+          <w:numId w:val="3"/>
+        </w:numPr>
+      </w:pPr>
+      <w:r>
+        <w:t xml:space="preserve">Cmd+N — new chat</w:t>
+      </w:r>
+    </w:p>
+    <w:p>
+      <w:pPr>
+        <w:pStyle w:val="ListParagraph"/>
+        <w:numPr>
+          <w:ilvl w:val="0"/>
+          <w:numId w:val="3"/>
+        </w:numPr>
+      </w:pPr>
+      <w:r>
+        <w:t xml:space="preserve">Cmd+L — open model library</w:t>
+      </w:r>
+    </w:p>
+    <w:p>
+      <w:pPr>
+        <w:pStyle w:val="ListParagraph"/>
+        <w:numPr>
+          <w:ilvl w:val="0"/>
+          <w:numId w:val="3"/>
+        </w:numPr>
+      </w:pPr>
+      <w:r>
+        <w:t xml:space="preserve">Cmd+K — focus model picker</w:t>
+      </w:r>
+    </w:p>
+    <w:p>
+      <w:pPr>
+        <w:pStyle w:val="Heading1"/>
+      </w:pPr>
+      <w:r>
+        <w:t xml:space="preserve">9. Voice input</w:t>
       </w:r>
     </w:p>
     <w:p>
@@ -2062,7 +2363,7 @@
         <w:pStyle w:val="Heading1"/>
       </w:pPr>
       <w:r>
-        <w:t xml:space="preserve">8. File drag-drop</w:t>
+        <w:t xml:space="preserve">10. File drag-drop</w:t>
       </w:r>
     </w:p>
     <w:p>
@@ -2075,7 +2376,7 @@
         <w:pStyle w:val="Heading1"/>
       </w:pPr>
       <w:r>
-        <w:t xml:space="preserve">9. Updates</w:t>
+        <w:t xml:space="preserve">11. Updates</w:t>
       </w:r>
     </w:p>
     <w:p>
@@ -2117,7 +2418,7 @@
         <w:pStyle w:val="Heading1"/>
       </w:pPr>
       <w:r>
-        <w:t xml:space="preserve">10. Troubleshooting</w:t>
+        <w:t xml:space="preserve">12. Troubleshooting</w:t>
       </w:r>
     </w:p>
     <w:p>
@@ -2229,6 +2530,36 @@
     <w:p>
       <w:r>
         <w:t xml:space="preserve">Then retry npm run release.</w:t>
+      </w:r>
+    </w:p>
+    <w:p>
+      <w:pPr>
+        <w:pStyle w:val="Heading2"/>
+      </w:pPr>
+      <w:r>
+        <w:t xml:space="preserve">Native inference build fails on metal compiler</w:t>
+      </w:r>
+    </w:p>
+    <w:p>
+      <w:r>
+        <w:t xml:space="preserve">mistralrs needs Xcode + the Metal Toolchain (CLT alone isn't enough). Install full Xcode from App Store, then:</w:t>
+      </w:r>
+    </w:p>
+    <w:p>
+      <w:pPr>
+        <w:shd w:fill="F4F4F5" w:val="clear"/>
+        <w:spacing w:after="60" w:before="60"/>
+      </w:pPr>
+      <w:r>
+        <w:rPr>
+          <w:rFonts w:ascii="Menlo" w:cs="Menlo" w:eastAsia="Menlo" w:hAnsi="Menlo"/>
+          <w:sz w:val="18"/>
+          <w:szCs w:val="18"/>
+        </w:rPr>
+        <w:t xml:space="preserve">sudo xcode-select -s /Applications/Xcode.app/Contents/Developer
+sudo xcodebuild -runFirstLaunch
+sudo xcodebuild -license accept
+xcodebuild -downloadComponent MetalToolchain</w:t>
       </w:r>
     </w:p>
     <w:sectPr>

</xml_diff>

<commit_message>
docs: sync to v0.9.1 — backfill CHANGELOG, refresh README tool list, regen .docx
CHANGELOG.md
- Backfilled [0.7.3], [0.7.4], [0.8.0], [0.9.0], [0.9.1] entries that had
  landed in commits + releases without updates here.

README.md
- Version badge 0.7.2 → 0.9.1 (now matches package.json).
- Agent-mode bullet rewritten with category overview of all 32 tools
  (FS, shell, git, web, code intel, macOS, docs, background, recursive).

docs/USER_GUIDE.md
- Version + DMG filename refs 0.7.2 → 0.9.1.
- §6 agent tools: replaced the single 10-row table with 6 category
  tables (FS, shell+macOS, git, web, code intel, background+control).
- Preset table updated to reflect current allowed tools.

docs/Froglips-User-Guide.docx
- Regenerated from updated script. Title page version + DMG filename
  refresh, agent section now mirrors the categorized USER_GUIDE.md
  structure with six sub-tables.
</commit_message>
<xml_diff>
--- a/docs/Froglips-User-Guide.docx
+++ b/docs/Froglips-User-Guide.docx
@@ -42,7 +42,7 @@
           <w:sz w:val="28"/>
           <w:szCs w:val="28"/>
         </w:rPr>
-        <w:t xml:space="preserve">Version 0.7.2</w:t>
+        <w:t xml:space="preserve">Version 0.9.1</w:t>
       </w:r>
     </w:p>
     <w:p>
@@ -106,7 +106,7 @@
         </w:numPr>
       </w:pPr>
       <w:r>
-        <w:t xml:space="preserve">Download Froglips_0.7.2_aarch64.dmg from the GitHub Releases page.</w:t>
+        <w:t xml:space="preserve">Download Froglips_0.9.1_aarch64.dmg from the GitHub Releases page.</w:t>
       </w:r>
     </w:p>
     <w:p>
@@ -1089,7 +1089,15 @@
     </w:p>
     <w:p>
       <w:r>
-        <w:t xml:space="preserve">The agent has direct access to the user's filesystem and shell via 10 tools:</w:t>
+        <w:t xml:space="preserve">The agent has direct access via 32 tools, grouped by category.</w:t>
+      </w:r>
+    </w:p>
+    <w:p>
+      <w:pPr>
+        <w:pStyle w:val="Heading3"/>
+      </w:pPr>
+      <w:r>
+        <w:t xml:space="preserve">Filesystem</w:t>
       </w:r>
     </w:p>
     <w:tbl>
@@ -1208,7 +1216,7 @@
           </w:tcPr>
           <w:p>
             <w:r>
-              <w:t xml:space="preserve">Read file contents (paginated, 64 KB chunks); non-UTF8 returns {binary: true}</w:t>
+              <w:t xml:space="preserve">Paginated read; non-UTF8 returns {binary: true}</w:t>
             </w:r>
           </w:p>
         </w:tc>
@@ -1254,7 +1262,7 @@
           </w:tcPr>
           <w:p>
             <w:r>
-              <w:t xml:space="preserve">List directory entries with kind + size</w:t>
+              <w:t xml:space="preserve">Directory entries with kind + size</w:t>
             </w:r>
           </w:p>
         </w:tc>
@@ -1300,7 +1308,7 @@
           </w:tcPr>
           <w:p>
             <w:r>
-              <w:t xml:space="preserve">Recursive grep with filename glob (*.ts). Set regex=true for Rust regex syntax</w:t>
+              <w:t xml:space="preserve">Recursive grep + glob; regex=true for regex</w:t>
             </w:r>
           </w:p>
         </w:tc>
@@ -1346,7 +1354,7 @@
           </w:tcPr>
           <w:p>
             <w:r>
-              <w:t xml:space="preserve">Check whether a path exists + its kind</w:t>
+              <w:t xml:space="preserve">Check existence + kind</w:t>
             </w:r>
           </w:p>
         </w:tc>
@@ -1392,7 +1400,7 @@
           </w:tcPr>
           <w:p>
             <w:r>
-              <w:t xml:space="preserve">Find-and-replace edit on existing files</w:t>
+              <w:t xml:space="preserve">Find-and-replace</w:t>
             </w:r>
           </w:p>
         </w:tc>
@@ -1438,7 +1446,7 @@
           </w:tcPr>
           <w:p>
             <w:r>
-              <w:t xml:space="preserve">Apply multiple find-and-replace edits to one file atomically</w:t>
+              <w:t xml:space="preserve">N edits to one file, atomic</w:t>
             </w:r>
           </w:p>
         </w:tc>
@@ -1484,7 +1492,7 @@
           </w:tcPr>
           <w:p>
             <w:r>
-              <w:t xml:space="preserve">Write or overwrite a file (requires approval)</w:t>
+              <w:t xml:space="preserve">Write/overwrite (approval)</w:t>
             </w:r>
           </w:p>
         </w:tc>
@@ -1508,6 +1516,136 @@
           </w:tcPr>
           <w:p>
             <w:r>
+              <w:t xml:space="preserve">read_pdf</w:t>
+            </w:r>
+          </w:p>
+        </w:tc>
+        <w:tc>
+          <w:tcPr>
+            <w:tcW w:type="dxa" w:w="6960"/>
+            <w:tcBorders>
+              <w:top w:val="single" w:color="CCCCCC" w:sz="4"/>
+              <w:left w:val="single" w:color="CCCCCC" w:sz="4"/>
+              <w:bottom w:val="single" w:color="CCCCCC" w:sz="4"/>
+              <w:right w:val="single" w:color="CCCCCC" w:sz="4"/>
+            </w:tcBorders>
+            <w:tcMar>
+              <w:top w:type="dxa" w:w="80"/>
+              <w:left w:type="dxa" w:w="120"/>
+              <w:bottom w:type="dxa" w:w="80"/>
+              <w:right w:type="dxa" w:w="120"/>
+            </w:tcMar>
+          </w:tcPr>
+          <w:p>
+            <w:r>
+              <w:t xml:space="preserve">Extract text from a PDF</w:t>
+            </w:r>
+          </w:p>
+        </w:tc>
+      </w:tr>
+    </w:tbl>
+    <w:p>
+      <w:pPr>
+        <w:pStyle w:val="Heading3"/>
+      </w:pPr>
+      <w:r>
+        <w:t xml:space="preserve">Shell + macOS automation</w:t>
+      </w:r>
+    </w:p>
+    <w:tbl>
+      <w:tblPr>
+        <w:tblW w:type="dxa" w:w="9360"/>
+        <w:tblBorders>
+          <w:top w:val="single" w:color="auto" w:sz="4"/>
+          <w:left w:val="single" w:color="auto" w:sz="4"/>
+          <w:bottom w:val="single" w:color="auto" w:sz="4"/>
+          <w:right w:val="single" w:color="auto" w:sz="4"/>
+          <w:insideH w:val="single" w:color="auto" w:sz="4"/>
+          <w:insideV w:val="single" w:color="auto" w:sz="4"/>
+        </w:tblBorders>
+      </w:tblPr>
+      <w:tblGrid>
+        <w:gridCol w:w="2400"/>
+        <w:gridCol w:w="6960"/>
+      </w:tblGrid>
+      <w:tr>
+        <w:trPr>
+          <w:tblHeader/>
+        </w:trPr>
+        <w:tc>
+          <w:tcPr>
+            <w:tcW w:type="dxa" w:w="2400"/>
+            <w:tcBorders>
+              <w:top w:val="single" w:color="CCCCCC" w:sz="4"/>
+              <w:left w:val="single" w:color="CCCCCC" w:sz="4"/>
+              <w:bottom w:val="single" w:color="CCCCCC" w:sz="4"/>
+              <w:right w:val="single" w:color="CCCCCC" w:sz="4"/>
+            </w:tcBorders>
+            <w:shd w:fill="E5E7EB" w:val="clear"/>
+            <w:tcMar>
+              <w:top w:type="dxa" w:w="80"/>
+              <w:left w:type="dxa" w:w="120"/>
+              <w:bottom w:type="dxa" w:w="80"/>
+              <w:right w:type="dxa" w:w="120"/>
+            </w:tcMar>
+          </w:tcPr>
+          <w:p>
+            <w:r>
+              <w:rPr>
+                <w:b/>
+                <w:bCs/>
+              </w:rPr>
+              <w:t xml:space="preserve">Tool</w:t>
+            </w:r>
+          </w:p>
+        </w:tc>
+        <w:tc>
+          <w:tcPr>
+            <w:tcW w:type="dxa" w:w="6960"/>
+            <w:tcBorders>
+              <w:top w:val="single" w:color="CCCCCC" w:sz="4"/>
+              <w:left w:val="single" w:color="CCCCCC" w:sz="4"/>
+              <w:bottom w:val="single" w:color="CCCCCC" w:sz="4"/>
+              <w:right w:val="single" w:color="CCCCCC" w:sz="4"/>
+            </w:tcBorders>
+            <w:shd w:fill="E5E7EB" w:val="clear"/>
+            <w:tcMar>
+              <w:top w:type="dxa" w:w="80"/>
+              <w:left w:type="dxa" w:w="120"/>
+              <w:bottom w:type="dxa" w:w="80"/>
+              <w:right w:type="dxa" w:w="120"/>
+            </w:tcMar>
+          </w:tcPr>
+          <w:p>
+            <w:r>
+              <w:rPr>
+                <w:b/>
+                <w:bCs/>
+              </w:rPr>
+              <w:t xml:space="preserve">What it does</w:t>
+            </w:r>
+          </w:p>
+        </w:tc>
+      </w:tr>
+      <w:tr>
+        <w:tc>
+          <w:tcPr>
+            <w:tcW w:type="dxa" w:w="2400"/>
+            <w:tcBorders>
+              <w:top w:val="single" w:color="CCCCCC" w:sz="4"/>
+              <w:left w:val="single" w:color="CCCCCC" w:sz="4"/>
+              <w:bottom w:val="single" w:color="CCCCCC" w:sz="4"/>
+              <w:right w:val="single" w:color="CCCCCC" w:sz="4"/>
+            </w:tcBorders>
+            <w:tcMar>
+              <w:top w:type="dxa" w:w="80"/>
+              <w:left w:type="dxa" w:w="120"/>
+              <w:bottom w:type="dxa" w:w="80"/>
+              <w:right w:type="dxa" w:w="120"/>
+            </w:tcMar>
+          </w:tcPr>
+          <w:p>
+            <w:r>
               <w:t xml:space="preserve">run_shell</w:t>
             </w:r>
           </w:p>
@@ -1530,7 +1668,7 @@
           </w:tcPr>
           <w:p>
             <w:r>
-              <w:t xml:space="preserve">Execute via sh -c (requires approval, 30 s timeout)</w:t>
+              <w:t xml:space="preserve">sh -c, 30s timeout, optional cwd+env (approval)</w:t>
             </w:r>
           </w:p>
         </w:tc>
@@ -1554,6 +1692,320 @@
           </w:tcPr>
           <w:p>
             <w:r>
+              <w:t xml:space="preserve">applescript_run</w:t>
+            </w:r>
+          </w:p>
+        </w:tc>
+        <w:tc>
+          <w:tcPr>
+            <w:tcW w:type="dxa" w:w="6960"/>
+            <w:tcBorders>
+              <w:top w:val="single" w:color="CCCCCC" w:sz="4"/>
+              <w:left w:val="single" w:color="CCCCCC" w:sz="4"/>
+              <w:bottom w:val="single" w:color="CCCCCC" w:sz="4"/>
+              <w:right w:val="single" w:color="CCCCCC" w:sz="4"/>
+            </w:tcBorders>
+            <w:tcMar>
+              <w:top w:type="dxa" w:w="80"/>
+              <w:left w:type="dxa" w:w="120"/>
+              <w:bottom w:type="dxa" w:w="80"/>
+              <w:right w:type="dxa" w:w="120"/>
+            </w:tcMar>
+          </w:tcPr>
+          <w:p>
+            <w:r>
+              <w:t xml:space="preserve">osascript -e (approval)</w:t>
+            </w:r>
+          </w:p>
+        </w:tc>
+      </w:tr>
+      <w:tr>
+        <w:tc>
+          <w:tcPr>
+            <w:tcW w:type="dxa" w:w="2400"/>
+            <w:tcBorders>
+              <w:top w:val="single" w:color="CCCCCC" w:sz="4"/>
+              <w:left w:val="single" w:color="CCCCCC" w:sz="4"/>
+              <w:bottom w:val="single" w:color="CCCCCC" w:sz="4"/>
+              <w:right w:val="single" w:color="CCCCCC" w:sz="4"/>
+            </w:tcBorders>
+            <w:tcMar>
+              <w:top w:type="dxa" w:w="80"/>
+              <w:left w:type="dxa" w:w="120"/>
+              <w:bottom w:type="dxa" w:w="80"/>
+              <w:right w:type="dxa" w:w="120"/>
+            </w:tcMar>
+          </w:tcPr>
+          <w:p>
+            <w:r>
+              <w:t xml:space="preserve">open_app</w:t>
+            </w:r>
+          </w:p>
+        </w:tc>
+        <w:tc>
+          <w:tcPr>
+            <w:tcW w:type="dxa" w:w="6960"/>
+            <w:tcBorders>
+              <w:top w:val="single" w:color="CCCCCC" w:sz="4"/>
+              <w:left w:val="single" w:color="CCCCCC" w:sz="4"/>
+              <w:bottom w:val="single" w:color="CCCCCC" w:sz="4"/>
+              <w:right w:val="single" w:color="CCCCCC" w:sz="4"/>
+            </w:tcBorders>
+            <w:tcMar>
+              <w:top w:type="dxa" w:w="80"/>
+              <w:left w:type="dxa" w:w="120"/>
+              <w:bottom w:type="dxa" w:w="80"/>
+              <w:right w:type="dxa" w:w="120"/>
+            </w:tcMar>
+          </w:tcPr>
+          <w:p>
+            <w:r>
+              <w:t xml:space="preserve">open -a (approval)</w:t>
+            </w:r>
+          </w:p>
+        </w:tc>
+      </w:tr>
+      <w:tr>
+        <w:tc>
+          <w:tcPr>
+            <w:tcW w:type="dxa" w:w="2400"/>
+            <w:tcBorders>
+              <w:top w:val="single" w:color="CCCCCC" w:sz="4"/>
+              <w:left w:val="single" w:color="CCCCCC" w:sz="4"/>
+              <w:bottom w:val="single" w:color="CCCCCC" w:sz="4"/>
+              <w:right w:val="single" w:color="CCCCCC" w:sz="4"/>
+            </w:tcBorders>
+            <w:tcMar>
+              <w:top w:type="dxa" w:w="80"/>
+              <w:left w:type="dxa" w:w="120"/>
+              <w:bottom w:type="dxa" w:w="80"/>
+              <w:right w:type="dxa" w:w="120"/>
+            </w:tcMar>
+          </w:tcPr>
+          <w:p>
+            <w:r>
+              <w:t xml:space="preserve">show_notification</w:t>
+            </w:r>
+          </w:p>
+        </w:tc>
+        <w:tc>
+          <w:tcPr>
+            <w:tcW w:type="dxa" w:w="6960"/>
+            <w:tcBorders>
+              <w:top w:val="single" w:color="CCCCCC" w:sz="4"/>
+              <w:left w:val="single" w:color="CCCCCC" w:sz="4"/>
+              <w:bottom w:val="single" w:color="CCCCCC" w:sz="4"/>
+              <w:right w:val="single" w:color="CCCCCC" w:sz="4"/>
+            </w:tcBorders>
+            <w:tcMar>
+              <w:top w:type="dxa" w:w="80"/>
+              <w:left w:type="dxa" w:w="120"/>
+              <w:bottom w:type="dxa" w:w="80"/>
+              <w:right w:type="dxa" w:w="120"/>
+            </w:tcMar>
+          </w:tcPr>
+          <w:p>
+            <w:r>
+              <w:t xml:space="preserve">Native notification</w:t>
+            </w:r>
+          </w:p>
+        </w:tc>
+      </w:tr>
+      <w:tr>
+        <w:tc>
+          <w:tcPr>
+            <w:tcW w:type="dxa" w:w="2400"/>
+            <w:tcBorders>
+              <w:top w:val="single" w:color="CCCCCC" w:sz="4"/>
+              <w:left w:val="single" w:color="CCCCCC" w:sz="4"/>
+              <w:bottom w:val="single" w:color="CCCCCC" w:sz="4"/>
+              <w:right w:val="single" w:color="CCCCCC" w:sz="4"/>
+            </w:tcBorders>
+            <w:tcMar>
+              <w:top w:type="dxa" w:w="80"/>
+              <w:left w:type="dxa" w:w="120"/>
+              <w:bottom w:type="dxa" w:w="80"/>
+              <w:right w:type="dxa" w:w="120"/>
+            </w:tcMar>
+          </w:tcPr>
+          <w:p>
+            <w:r>
+              <w:t xml:space="preserve">screenshot</w:t>
+            </w:r>
+          </w:p>
+        </w:tc>
+        <w:tc>
+          <w:tcPr>
+            <w:tcW w:type="dxa" w:w="6960"/>
+            <w:tcBorders>
+              <w:top w:val="single" w:color="CCCCCC" w:sz="4"/>
+              <w:left w:val="single" w:color="CCCCCC" w:sz="4"/>
+              <w:bottom w:val="single" w:color="CCCCCC" w:sz="4"/>
+              <w:right w:val="single" w:color="CCCCCC" w:sz="4"/>
+            </w:tcBorders>
+            <w:tcMar>
+              <w:top w:type="dxa" w:w="80"/>
+              <w:left w:type="dxa" w:w="120"/>
+              <w:bottom w:type="dxa" w:w="80"/>
+              <w:right w:type="dxa" w:w="120"/>
+            </w:tcMar>
+          </w:tcPr>
+          <w:p>
+            <w:r>
+              <w:t xml:space="preserve">screencapture -x</w:t>
+            </w:r>
+          </w:p>
+        </w:tc>
+      </w:tr>
+      <w:tr>
+        <w:tc>
+          <w:tcPr>
+            <w:tcW w:type="dxa" w:w="2400"/>
+            <w:tcBorders>
+              <w:top w:val="single" w:color="CCCCCC" w:sz="4"/>
+              <w:left w:val="single" w:color="CCCCCC" w:sz="4"/>
+              <w:bottom w:val="single" w:color="CCCCCC" w:sz="4"/>
+              <w:right w:val="single" w:color="CCCCCC" w:sz="4"/>
+            </w:tcBorders>
+            <w:tcMar>
+              <w:top w:type="dxa" w:w="80"/>
+              <w:left w:type="dxa" w:w="120"/>
+              <w:bottom w:type="dxa" w:w="80"/>
+              <w:right w:type="dxa" w:w="120"/>
+            </w:tcMar>
+          </w:tcPr>
+          <w:p>
+            <w:r>
+              <w:t xml:space="preserve">clipboard_get / clipboard_set</w:t>
+            </w:r>
+          </w:p>
+        </w:tc>
+        <w:tc>
+          <w:tcPr>
+            <w:tcW w:type="dxa" w:w="6960"/>
+            <w:tcBorders>
+              <w:top w:val="single" w:color="CCCCCC" w:sz="4"/>
+              <w:left w:val="single" w:color="CCCCCC" w:sz="4"/>
+              <w:bottom w:val="single" w:color="CCCCCC" w:sz="4"/>
+              <w:right w:val="single" w:color="CCCCCC" w:sz="4"/>
+            </w:tcBorders>
+            <w:tcMar>
+              <w:top w:type="dxa" w:w="80"/>
+              <w:left w:type="dxa" w:w="120"/>
+              <w:bottom w:type="dxa" w:w="80"/>
+              <w:right w:type="dxa" w:w="120"/>
+            </w:tcMar>
+          </w:tcPr>
+          <w:p>
+            <w:r>
+              <w:t xml:space="preserve">pbpaste / pbcopy (set: approval)</w:t>
+            </w:r>
+          </w:p>
+        </w:tc>
+      </w:tr>
+    </w:tbl>
+    <w:p>
+      <w:pPr>
+        <w:pStyle w:val="Heading3"/>
+      </w:pPr>
+      <w:r>
+        <w:t xml:space="preserve">Git</w:t>
+      </w:r>
+    </w:p>
+    <w:tbl>
+      <w:tblPr>
+        <w:tblW w:type="dxa" w:w="9360"/>
+        <w:tblBorders>
+          <w:top w:val="single" w:color="auto" w:sz="4"/>
+          <w:left w:val="single" w:color="auto" w:sz="4"/>
+          <w:bottom w:val="single" w:color="auto" w:sz="4"/>
+          <w:right w:val="single" w:color="auto" w:sz="4"/>
+          <w:insideH w:val="single" w:color="auto" w:sz="4"/>
+          <w:insideV w:val="single" w:color="auto" w:sz="4"/>
+        </w:tblBorders>
+      </w:tblPr>
+      <w:tblGrid>
+        <w:gridCol w:w="2400"/>
+        <w:gridCol w:w="6960"/>
+      </w:tblGrid>
+      <w:tr>
+        <w:trPr>
+          <w:tblHeader/>
+        </w:trPr>
+        <w:tc>
+          <w:tcPr>
+            <w:tcW w:type="dxa" w:w="2400"/>
+            <w:tcBorders>
+              <w:top w:val="single" w:color="CCCCCC" w:sz="4"/>
+              <w:left w:val="single" w:color="CCCCCC" w:sz="4"/>
+              <w:bottom w:val="single" w:color="CCCCCC" w:sz="4"/>
+              <w:right w:val="single" w:color="CCCCCC" w:sz="4"/>
+            </w:tcBorders>
+            <w:shd w:fill="E5E7EB" w:val="clear"/>
+            <w:tcMar>
+              <w:top w:type="dxa" w:w="80"/>
+              <w:left w:type="dxa" w:w="120"/>
+              <w:bottom w:type="dxa" w:w="80"/>
+              <w:right w:type="dxa" w:w="120"/>
+            </w:tcMar>
+          </w:tcPr>
+          <w:p>
+            <w:r>
+              <w:rPr>
+                <w:b/>
+                <w:bCs/>
+              </w:rPr>
+              <w:t xml:space="preserve">Tool</w:t>
+            </w:r>
+          </w:p>
+        </w:tc>
+        <w:tc>
+          <w:tcPr>
+            <w:tcW w:type="dxa" w:w="6960"/>
+            <w:tcBorders>
+              <w:top w:val="single" w:color="CCCCCC" w:sz="4"/>
+              <w:left w:val="single" w:color="CCCCCC" w:sz="4"/>
+              <w:bottom w:val="single" w:color="CCCCCC" w:sz="4"/>
+              <w:right w:val="single" w:color="CCCCCC" w:sz="4"/>
+            </w:tcBorders>
+            <w:shd w:fill="E5E7EB" w:val="clear"/>
+            <w:tcMar>
+              <w:top w:type="dxa" w:w="80"/>
+              <w:left w:type="dxa" w:w="120"/>
+              <w:bottom w:type="dxa" w:w="80"/>
+              <w:right w:type="dxa" w:w="120"/>
+            </w:tcMar>
+          </w:tcPr>
+          <w:p>
+            <w:r>
+              <w:rPr>
+                <w:b/>
+                <w:bCs/>
+              </w:rPr>
+              <w:t xml:space="preserve">What it does</w:t>
+            </w:r>
+          </w:p>
+        </w:tc>
+      </w:tr>
+      <w:tr>
+        <w:tc>
+          <w:tcPr>
+            <w:tcW w:type="dxa" w:w="2400"/>
+            <w:tcBorders>
+              <w:top w:val="single" w:color="CCCCCC" w:sz="4"/>
+              <w:left w:val="single" w:color="CCCCCC" w:sz="4"/>
+              <w:bottom w:val="single" w:color="CCCCCC" w:sz="4"/>
+              <w:right w:val="single" w:color="CCCCCC" w:sz="4"/>
+            </w:tcBorders>
+            <w:tcMar>
+              <w:top w:type="dxa" w:w="80"/>
+              <w:left w:type="dxa" w:w="120"/>
+              <w:bottom w:type="dxa" w:w="80"/>
+              <w:right w:type="dxa" w:w="120"/>
+            </w:tcMar>
+          </w:tcPr>
+          <w:p>
+            <w:r>
               <w:t xml:space="preserve">git_status</w:t>
             </w:r>
           </w:p>
@@ -1576,7 +2028,7 @@
           </w:tcPr>
           <w:p>
             <w:r>
-              <w:t xml:space="preserve">git status --short --branch in workspace or given path</w:t>
+              <w:t xml:space="preserve">status --short --branch</w:t>
             </w:r>
           </w:p>
         </w:tc>
@@ -1622,7 +2074,903 @@
           </w:tcPr>
           <w:p>
             <w:r>
-              <w:t xml:space="preserve">git diff (optional staged=true) in workspace or given path</w:t>
+              <w:t xml:space="preserve">diff (optional staged=true)</w:t>
+            </w:r>
+          </w:p>
+        </w:tc>
+      </w:tr>
+      <w:tr>
+        <w:tc>
+          <w:tcPr>
+            <w:tcW w:type="dxa" w:w="2400"/>
+            <w:tcBorders>
+              <w:top w:val="single" w:color="CCCCCC" w:sz="4"/>
+              <w:left w:val="single" w:color="CCCCCC" w:sz="4"/>
+              <w:bottom w:val="single" w:color="CCCCCC" w:sz="4"/>
+              <w:right w:val="single" w:color="CCCCCC" w:sz="4"/>
+            </w:tcBorders>
+            <w:tcMar>
+              <w:top w:type="dxa" w:w="80"/>
+              <w:left w:type="dxa" w:w="120"/>
+              <w:bottom w:type="dxa" w:w="80"/>
+              <w:right w:type="dxa" w:w="120"/>
+            </w:tcMar>
+          </w:tcPr>
+          <w:p>
+            <w:r>
+              <w:t xml:space="preserve">git_log</w:t>
+            </w:r>
+          </w:p>
+        </w:tc>
+        <w:tc>
+          <w:tcPr>
+            <w:tcW w:type="dxa" w:w="6960"/>
+            <w:tcBorders>
+              <w:top w:val="single" w:color="CCCCCC" w:sz="4"/>
+              <w:left w:val="single" w:color="CCCCCC" w:sz="4"/>
+              <w:bottom w:val="single" w:color="CCCCCC" w:sz="4"/>
+              <w:right w:val="single" w:color="CCCCCC" w:sz="4"/>
+            </w:tcBorders>
+            <w:tcMar>
+              <w:top w:type="dxa" w:w="80"/>
+              <w:left w:type="dxa" w:w="120"/>
+              <w:bottom w:type="dxa" w:w="80"/>
+              <w:right w:type="dxa" w:w="120"/>
+            </w:tcMar>
+          </w:tcPr>
+          <w:p>
+            <w:r>
+              <w:t xml:space="preserve">oneline log (default 20, max 200)</w:t>
+            </w:r>
+          </w:p>
+        </w:tc>
+      </w:tr>
+      <w:tr>
+        <w:tc>
+          <w:tcPr>
+            <w:tcW w:type="dxa" w:w="2400"/>
+            <w:tcBorders>
+              <w:top w:val="single" w:color="CCCCCC" w:sz="4"/>
+              <w:left w:val="single" w:color="CCCCCC" w:sz="4"/>
+              <w:bottom w:val="single" w:color="CCCCCC" w:sz="4"/>
+              <w:right w:val="single" w:color="CCCCCC" w:sz="4"/>
+            </w:tcBorders>
+            <w:tcMar>
+              <w:top w:type="dxa" w:w="80"/>
+              <w:left w:type="dxa" w:w="120"/>
+              <w:bottom w:type="dxa" w:w="80"/>
+              <w:right w:type="dxa" w:w="120"/>
+            </w:tcMar>
+          </w:tcPr>
+          <w:p>
+            <w:r>
+              <w:t xml:space="preserve">git_show</w:t>
+            </w:r>
+          </w:p>
+        </w:tc>
+        <w:tc>
+          <w:tcPr>
+            <w:tcW w:type="dxa" w:w="6960"/>
+            <w:tcBorders>
+              <w:top w:val="single" w:color="CCCCCC" w:sz="4"/>
+              <w:left w:val="single" w:color="CCCCCC" w:sz="4"/>
+              <w:bottom w:val="single" w:color="CCCCCC" w:sz="4"/>
+              <w:right w:val="single" w:color="CCCCCC" w:sz="4"/>
+            </w:tcBorders>
+            <w:tcMar>
+              <w:top w:type="dxa" w:w="80"/>
+              <w:left w:type="dxa" w:w="120"/>
+              <w:bottom w:type="dxa" w:w="80"/>
+              <w:right w:type="dxa" w:w="120"/>
+            </w:tcMar>
+          </w:tcPr>
+          <w:p>
+            <w:r>
+              <w:t xml:space="preserve">show a commit / tag / ref</w:t>
+            </w:r>
+          </w:p>
+        </w:tc>
+      </w:tr>
+      <w:tr>
+        <w:tc>
+          <w:tcPr>
+            <w:tcW w:type="dxa" w:w="2400"/>
+            <w:tcBorders>
+              <w:top w:val="single" w:color="CCCCCC" w:sz="4"/>
+              <w:left w:val="single" w:color="CCCCCC" w:sz="4"/>
+              <w:bottom w:val="single" w:color="CCCCCC" w:sz="4"/>
+              <w:right w:val="single" w:color="CCCCCC" w:sz="4"/>
+            </w:tcBorders>
+            <w:tcMar>
+              <w:top w:type="dxa" w:w="80"/>
+              <w:left w:type="dxa" w:w="120"/>
+              <w:bottom w:type="dxa" w:w="80"/>
+              <w:right w:type="dxa" w:w="120"/>
+            </w:tcMar>
+          </w:tcPr>
+          <w:p>
+            <w:r>
+              <w:t xml:space="preserve">git_branches</w:t>
+            </w:r>
+          </w:p>
+        </w:tc>
+        <w:tc>
+          <w:tcPr>
+            <w:tcW w:type="dxa" w:w="6960"/>
+            <w:tcBorders>
+              <w:top w:val="single" w:color="CCCCCC" w:sz="4"/>
+              <w:left w:val="single" w:color="CCCCCC" w:sz="4"/>
+              <w:bottom w:val="single" w:color="CCCCCC" w:sz="4"/>
+              <w:right w:val="single" w:color="CCCCCC" w:sz="4"/>
+            </w:tcBorders>
+            <w:tcMar>
+              <w:top w:type="dxa" w:w="80"/>
+              <w:left w:type="dxa" w:w="120"/>
+              <w:bottom w:type="dxa" w:w="80"/>
+              <w:right w:type="dxa" w:w="120"/>
+            </w:tcMar>
+          </w:tcPr>
+          <w:p>
+            <w:r>
+              <w:t xml:space="preserve">list local + remote branches</w:t>
+            </w:r>
+          </w:p>
+        </w:tc>
+      </w:tr>
+      <w:tr>
+        <w:tc>
+          <w:tcPr>
+            <w:tcW w:type="dxa" w:w="2400"/>
+            <w:tcBorders>
+              <w:top w:val="single" w:color="CCCCCC" w:sz="4"/>
+              <w:left w:val="single" w:color="CCCCCC" w:sz="4"/>
+              <w:bottom w:val="single" w:color="CCCCCC" w:sz="4"/>
+              <w:right w:val="single" w:color="CCCCCC" w:sz="4"/>
+            </w:tcBorders>
+            <w:tcMar>
+              <w:top w:type="dxa" w:w="80"/>
+              <w:left w:type="dxa" w:w="120"/>
+              <w:bottom w:type="dxa" w:w="80"/>
+              <w:right w:type="dxa" w:w="120"/>
+            </w:tcMar>
+          </w:tcPr>
+          <w:p>
+            <w:r>
+              <w:t xml:space="preserve">git_commit</w:t>
+            </w:r>
+          </w:p>
+        </w:tc>
+        <w:tc>
+          <w:tcPr>
+            <w:tcW w:type="dxa" w:w="6960"/>
+            <w:tcBorders>
+              <w:top w:val="single" w:color="CCCCCC" w:sz="4"/>
+              <w:left w:val="single" w:color="CCCCCC" w:sz="4"/>
+              <w:bottom w:val="single" w:color="CCCCCC" w:sz="4"/>
+              <w:right w:val="single" w:color="CCCCCC" w:sz="4"/>
+            </w:tcBorders>
+            <w:tcMar>
+              <w:top w:type="dxa" w:w="80"/>
+              <w:left w:type="dxa" w:w="120"/>
+              <w:bottom w:type="dxa" w:w="80"/>
+              <w:right w:type="dxa" w:w="120"/>
+            </w:tcMar>
+          </w:tcPr>
+          <w:p>
+            <w:r>
+              <w:t xml:space="preserve">commit already-staged changes (approval)</w:t>
+            </w:r>
+          </w:p>
+        </w:tc>
+      </w:tr>
+    </w:tbl>
+    <w:p>
+      <w:pPr>
+        <w:pStyle w:val="Heading3"/>
+      </w:pPr>
+      <w:r>
+        <w:t xml:space="preserve">Web</w:t>
+      </w:r>
+    </w:p>
+    <w:tbl>
+      <w:tblPr>
+        <w:tblW w:type="dxa" w:w="9360"/>
+        <w:tblBorders>
+          <w:top w:val="single" w:color="auto" w:sz="4"/>
+          <w:left w:val="single" w:color="auto" w:sz="4"/>
+          <w:bottom w:val="single" w:color="auto" w:sz="4"/>
+          <w:right w:val="single" w:color="auto" w:sz="4"/>
+          <w:insideH w:val="single" w:color="auto" w:sz="4"/>
+          <w:insideV w:val="single" w:color="auto" w:sz="4"/>
+        </w:tblBorders>
+      </w:tblPr>
+      <w:tblGrid>
+        <w:gridCol w:w="2400"/>
+        <w:gridCol w:w="6960"/>
+      </w:tblGrid>
+      <w:tr>
+        <w:trPr>
+          <w:tblHeader/>
+        </w:trPr>
+        <w:tc>
+          <w:tcPr>
+            <w:tcW w:type="dxa" w:w="2400"/>
+            <w:tcBorders>
+              <w:top w:val="single" w:color="CCCCCC" w:sz="4"/>
+              <w:left w:val="single" w:color="CCCCCC" w:sz="4"/>
+              <w:bottom w:val="single" w:color="CCCCCC" w:sz="4"/>
+              <w:right w:val="single" w:color="CCCCCC" w:sz="4"/>
+            </w:tcBorders>
+            <w:shd w:fill="E5E7EB" w:val="clear"/>
+            <w:tcMar>
+              <w:top w:type="dxa" w:w="80"/>
+              <w:left w:type="dxa" w:w="120"/>
+              <w:bottom w:type="dxa" w:w="80"/>
+              <w:right w:type="dxa" w:w="120"/>
+            </w:tcMar>
+          </w:tcPr>
+          <w:p>
+            <w:r>
+              <w:rPr>
+                <w:b/>
+                <w:bCs/>
+              </w:rPr>
+              <w:t xml:space="preserve">Tool</w:t>
+            </w:r>
+          </w:p>
+        </w:tc>
+        <w:tc>
+          <w:tcPr>
+            <w:tcW w:type="dxa" w:w="6960"/>
+            <w:tcBorders>
+              <w:top w:val="single" w:color="CCCCCC" w:sz="4"/>
+              <w:left w:val="single" w:color="CCCCCC" w:sz="4"/>
+              <w:bottom w:val="single" w:color="CCCCCC" w:sz="4"/>
+              <w:right w:val="single" w:color="CCCCCC" w:sz="4"/>
+            </w:tcBorders>
+            <w:shd w:fill="E5E7EB" w:val="clear"/>
+            <w:tcMar>
+              <w:top w:type="dxa" w:w="80"/>
+              <w:left w:type="dxa" w:w="120"/>
+              <w:bottom w:type="dxa" w:w="80"/>
+              <w:right w:type="dxa" w:w="120"/>
+            </w:tcMar>
+          </w:tcPr>
+          <w:p>
+            <w:r>
+              <w:rPr>
+                <w:b/>
+                <w:bCs/>
+              </w:rPr>
+              <w:t xml:space="preserve">What it does</w:t>
+            </w:r>
+          </w:p>
+        </w:tc>
+      </w:tr>
+      <w:tr>
+        <w:tc>
+          <w:tcPr>
+            <w:tcW w:type="dxa" w:w="2400"/>
+            <w:tcBorders>
+              <w:top w:val="single" w:color="CCCCCC" w:sz="4"/>
+              <w:left w:val="single" w:color="CCCCCC" w:sz="4"/>
+              <w:bottom w:val="single" w:color="CCCCCC" w:sz="4"/>
+              <w:right w:val="single" w:color="CCCCCC" w:sz="4"/>
+            </w:tcBorders>
+            <w:tcMar>
+              <w:top w:type="dxa" w:w="80"/>
+              <w:left w:type="dxa" w:w="120"/>
+              <w:bottom w:type="dxa" w:w="80"/>
+              <w:right w:type="dxa" w:w="120"/>
+            </w:tcMar>
+          </w:tcPr>
+          <w:p>
+            <w:r>
+              <w:t xml:space="preserve">web_fetch</w:t>
+            </w:r>
+          </w:p>
+        </w:tc>
+        <w:tc>
+          <w:tcPr>
+            <w:tcW w:type="dxa" w:w="6960"/>
+            <w:tcBorders>
+              <w:top w:val="single" w:color="CCCCCC" w:sz="4"/>
+              <w:left w:val="single" w:color="CCCCCC" w:sz="4"/>
+              <w:bottom w:val="single" w:color="CCCCCC" w:sz="4"/>
+              <w:right w:val="single" w:color="CCCCCC" w:sz="4"/>
+            </w:tcBorders>
+            <w:tcMar>
+              <w:top w:type="dxa" w:w="80"/>
+              <w:left w:type="dxa" w:w="120"/>
+              <w:bottom w:type="dxa" w:w="80"/>
+              <w:right w:type="dxa" w:w="120"/>
+            </w:tcMar>
+          </w:tcPr>
+          <w:p>
+            <w:r>
+              <w:t xml:space="preserve">GET + HTML-strip; SSRF-blocked on loopback/private/link-local</w:t>
+            </w:r>
+          </w:p>
+        </w:tc>
+      </w:tr>
+      <w:tr>
+        <w:tc>
+          <w:tcPr>
+            <w:tcW w:type="dxa" w:w="2400"/>
+            <w:tcBorders>
+              <w:top w:val="single" w:color="CCCCCC" w:sz="4"/>
+              <w:left w:val="single" w:color="CCCCCC" w:sz="4"/>
+              <w:bottom w:val="single" w:color="CCCCCC" w:sz="4"/>
+              <w:right w:val="single" w:color="CCCCCC" w:sz="4"/>
+            </w:tcBorders>
+            <w:tcMar>
+              <w:top w:type="dxa" w:w="80"/>
+              <w:left w:type="dxa" w:w="120"/>
+              <w:bottom w:type="dxa" w:w="80"/>
+              <w:right w:type="dxa" w:w="120"/>
+            </w:tcMar>
+          </w:tcPr>
+          <w:p>
+            <w:r>
+              <w:t xml:space="preserve">web_search</w:t>
+            </w:r>
+          </w:p>
+        </w:tc>
+        <w:tc>
+          <w:tcPr>
+            <w:tcW w:type="dxa" w:w="6960"/>
+            <w:tcBorders>
+              <w:top w:val="single" w:color="CCCCCC" w:sz="4"/>
+              <w:left w:val="single" w:color="CCCCCC" w:sz="4"/>
+              <w:bottom w:val="single" w:color="CCCCCC" w:sz="4"/>
+              <w:right w:val="single" w:color="CCCCCC" w:sz="4"/>
+            </w:tcBorders>
+            <w:tcMar>
+              <w:top w:type="dxa" w:w="80"/>
+              <w:left w:type="dxa" w:w="120"/>
+              <w:bottom w:type="dxa" w:w="80"/>
+              <w:right w:type="dxa" w:w="120"/>
+            </w:tcMar>
+          </w:tcPr>
+          <w:p>
+            <w:r>
+              <w:t xml:space="preserve">DuckDuckGo search (no API key)</w:t>
+            </w:r>
+          </w:p>
+        </w:tc>
+      </w:tr>
+      <w:tr>
+        <w:tc>
+          <w:tcPr>
+            <w:tcW w:type="dxa" w:w="2400"/>
+            <w:tcBorders>
+              <w:top w:val="single" w:color="CCCCCC" w:sz="4"/>
+              <w:left w:val="single" w:color="CCCCCC" w:sz="4"/>
+              <w:bottom w:val="single" w:color="CCCCCC" w:sz="4"/>
+              <w:right w:val="single" w:color="CCCCCC" w:sz="4"/>
+            </w:tcBorders>
+            <w:tcMar>
+              <w:top w:type="dxa" w:w="80"/>
+              <w:left w:type="dxa" w:w="120"/>
+              <w:bottom w:type="dxa" w:w="80"/>
+              <w:right w:type="dxa" w:w="120"/>
+            </w:tcMar>
+          </w:tcPr>
+          <w:p>
+            <w:r>
+              <w:t xml:space="preserve">http_request</w:t>
+            </w:r>
+          </w:p>
+        </w:tc>
+        <w:tc>
+          <w:tcPr>
+            <w:tcW w:type="dxa" w:w="6960"/>
+            <w:tcBorders>
+              <w:top w:val="single" w:color="CCCCCC" w:sz="4"/>
+              <w:left w:val="single" w:color="CCCCCC" w:sz="4"/>
+              <w:bottom w:val="single" w:color="CCCCCC" w:sz="4"/>
+              <w:right w:val="single" w:color="CCCCCC" w:sz="4"/>
+            </w:tcBorders>
+            <w:tcMar>
+              <w:top w:type="dxa" w:w="80"/>
+              <w:left w:type="dxa" w:w="120"/>
+              <w:bottom w:type="dxa" w:w="80"/>
+              <w:right w:type="dxa" w:w="120"/>
+            </w:tcMar>
+          </w:tcPr>
+          <w:p>
+            <w:r>
+              <w:t xml:space="preserve">GET/POST/PUT/PATCH/DELETE/HEAD (approval)</w:t>
+            </w:r>
+          </w:p>
+        </w:tc>
+      </w:tr>
+    </w:tbl>
+    <w:p>
+      <w:pPr>
+        <w:pStyle w:val="Heading3"/>
+      </w:pPr>
+      <w:r>
+        <w:t xml:space="preserve">Code intelligence</w:t>
+      </w:r>
+    </w:p>
+    <w:tbl>
+      <w:tblPr>
+        <w:tblW w:type="dxa" w:w="9360"/>
+        <w:tblBorders>
+          <w:top w:val="single" w:color="auto" w:sz="4"/>
+          <w:left w:val="single" w:color="auto" w:sz="4"/>
+          <w:bottom w:val="single" w:color="auto" w:sz="4"/>
+          <w:right w:val="single" w:color="auto" w:sz="4"/>
+          <w:insideH w:val="single" w:color="auto" w:sz="4"/>
+          <w:insideV w:val="single" w:color="auto" w:sz="4"/>
+        </w:tblBorders>
+      </w:tblPr>
+      <w:tblGrid>
+        <w:gridCol w:w="2400"/>
+        <w:gridCol w:w="6960"/>
+      </w:tblGrid>
+      <w:tr>
+        <w:trPr>
+          <w:tblHeader/>
+        </w:trPr>
+        <w:tc>
+          <w:tcPr>
+            <w:tcW w:type="dxa" w:w="2400"/>
+            <w:tcBorders>
+              <w:top w:val="single" w:color="CCCCCC" w:sz="4"/>
+              <w:left w:val="single" w:color="CCCCCC" w:sz="4"/>
+              <w:bottom w:val="single" w:color="CCCCCC" w:sz="4"/>
+              <w:right w:val="single" w:color="CCCCCC" w:sz="4"/>
+            </w:tcBorders>
+            <w:shd w:fill="E5E7EB" w:val="clear"/>
+            <w:tcMar>
+              <w:top w:type="dxa" w:w="80"/>
+              <w:left w:type="dxa" w:w="120"/>
+              <w:bottom w:type="dxa" w:w="80"/>
+              <w:right w:type="dxa" w:w="120"/>
+            </w:tcMar>
+          </w:tcPr>
+          <w:p>
+            <w:r>
+              <w:rPr>
+                <w:b/>
+                <w:bCs/>
+              </w:rPr>
+              <w:t xml:space="preserve">Tool</w:t>
+            </w:r>
+          </w:p>
+        </w:tc>
+        <w:tc>
+          <w:tcPr>
+            <w:tcW w:type="dxa" w:w="6960"/>
+            <w:tcBorders>
+              <w:top w:val="single" w:color="CCCCCC" w:sz="4"/>
+              <w:left w:val="single" w:color="CCCCCC" w:sz="4"/>
+              <w:bottom w:val="single" w:color="CCCCCC" w:sz="4"/>
+              <w:right w:val="single" w:color="CCCCCC" w:sz="4"/>
+            </w:tcBorders>
+            <w:shd w:fill="E5E7EB" w:val="clear"/>
+            <w:tcMar>
+              <w:top w:type="dxa" w:w="80"/>
+              <w:left w:type="dxa" w:w="120"/>
+              <w:bottom w:type="dxa" w:w="80"/>
+              <w:right w:type="dxa" w:w="120"/>
+            </w:tcMar>
+          </w:tcPr>
+          <w:p>
+            <w:r>
+              <w:rPr>
+                <w:b/>
+                <w:bCs/>
+              </w:rPr>
+              <w:t xml:space="preserve">What it does</w:t>
+            </w:r>
+          </w:p>
+        </w:tc>
+      </w:tr>
+      <w:tr>
+        <w:tc>
+          <w:tcPr>
+            <w:tcW w:type="dxa" w:w="2400"/>
+            <w:tcBorders>
+              <w:top w:val="single" w:color="CCCCCC" w:sz="4"/>
+              <w:left w:val="single" w:color="CCCCCC" w:sz="4"/>
+              <w:bottom w:val="single" w:color="CCCCCC" w:sz="4"/>
+              <w:right w:val="single" w:color="CCCCCC" w:sz="4"/>
+            </w:tcBorders>
+            <w:tcMar>
+              <w:top w:type="dxa" w:w="80"/>
+              <w:left w:type="dxa" w:w="120"/>
+              <w:bottom w:type="dxa" w:w="80"/>
+              <w:right w:type="dxa" w:w="120"/>
+            </w:tcMar>
+          </w:tcPr>
+          <w:p>
+            <w:r>
+              <w:t xml:space="preserve">find_definition</w:t>
+            </w:r>
+          </w:p>
+        </w:tc>
+        <w:tc>
+          <w:tcPr>
+            <w:tcW w:type="dxa" w:w="6960"/>
+            <w:tcBorders>
+              <w:top w:val="single" w:color="CCCCCC" w:sz="4"/>
+              <w:left w:val="single" w:color="CCCCCC" w:sz="4"/>
+              <w:bottom w:val="single" w:color="CCCCCC" w:sz="4"/>
+              <w:right w:val="single" w:color="CCCCCC" w:sz="4"/>
+            </w:tcBorders>
+            <w:tcMar>
+              <w:top w:type="dxa" w:w="80"/>
+              <w:left w:type="dxa" w:w="120"/>
+              <w:bottom w:type="dxa" w:w="80"/>
+              <w:right w:type="dxa" w:w="120"/>
+            </w:tcMar>
+          </w:tcPr>
+          <w:p>
+            <w:r>
+              <w:t xml:space="preserve">Heuristic regex for fn/def/class/etc.</w:t>
+            </w:r>
+          </w:p>
+        </w:tc>
+      </w:tr>
+      <w:tr>
+        <w:tc>
+          <w:tcPr>
+            <w:tcW w:type="dxa" w:w="2400"/>
+            <w:tcBorders>
+              <w:top w:val="single" w:color="CCCCCC" w:sz="4"/>
+              <w:left w:val="single" w:color="CCCCCC" w:sz="4"/>
+              <w:bottom w:val="single" w:color="CCCCCC" w:sz="4"/>
+              <w:right w:val="single" w:color="CCCCCC" w:sz="4"/>
+            </w:tcBorders>
+            <w:tcMar>
+              <w:top w:type="dxa" w:w="80"/>
+              <w:left w:type="dxa" w:w="120"/>
+              <w:bottom w:type="dxa" w:w="80"/>
+              <w:right w:type="dxa" w:w="120"/>
+            </w:tcMar>
+          </w:tcPr>
+          <w:p>
+            <w:r>
+              <w:t xml:space="preserve">find_references</w:t>
+            </w:r>
+          </w:p>
+        </w:tc>
+        <w:tc>
+          <w:tcPr>
+            <w:tcW w:type="dxa" w:w="6960"/>
+            <w:tcBorders>
+              <w:top w:val="single" w:color="CCCCCC" w:sz="4"/>
+              <w:left w:val="single" w:color="CCCCCC" w:sz="4"/>
+              <w:bottom w:val="single" w:color="CCCCCC" w:sz="4"/>
+              <w:right w:val="single" w:color="CCCCCC" w:sz="4"/>
+            </w:tcBorders>
+            <w:tcMar>
+              <w:top w:type="dxa" w:w="80"/>
+              <w:left w:type="dxa" w:w="120"/>
+              <w:bottom w:type="dxa" w:w="80"/>
+              <w:right w:type="dxa" w:w="120"/>
+            </w:tcMar>
+          </w:tcPr>
+          <w:p>
+            <w:r>
+              <w:t xml:space="preserve">Word-boundary regex</w:t>
+            </w:r>
+          </w:p>
+        </w:tc>
+      </w:tr>
+      <w:tr>
+        <w:tc>
+          <w:tcPr>
+            <w:tcW w:type="dxa" w:w="2400"/>
+            <w:tcBorders>
+              <w:top w:val="single" w:color="CCCCCC" w:sz="4"/>
+              <w:left w:val="single" w:color="CCCCCC" w:sz="4"/>
+              <w:bottom w:val="single" w:color="CCCCCC" w:sz="4"/>
+              <w:right w:val="single" w:color="CCCCCC" w:sz="4"/>
+            </w:tcBorders>
+            <w:tcMar>
+              <w:top w:type="dxa" w:w="80"/>
+              <w:left w:type="dxa" w:w="120"/>
+              <w:bottom w:type="dxa" w:w="80"/>
+              <w:right w:type="dxa" w:w="120"/>
+            </w:tcMar>
+          </w:tcPr>
+          <w:p>
+            <w:r>
+              <w:t xml:space="preserve">format_code</w:t>
+            </w:r>
+          </w:p>
+        </w:tc>
+        <w:tc>
+          <w:tcPr>
+            <w:tcW w:type="dxa" w:w="6960"/>
+            <w:tcBorders>
+              <w:top w:val="single" w:color="CCCCCC" w:sz="4"/>
+              <w:left w:val="single" w:color="CCCCCC" w:sz="4"/>
+              <w:bottom w:val="single" w:color="CCCCCC" w:sz="4"/>
+              <w:right w:val="single" w:color="CCCCCC" w:sz="4"/>
+            </w:tcBorders>
+            <w:tcMar>
+              <w:top w:type="dxa" w:w="80"/>
+              <w:left w:type="dxa" w:w="120"/>
+              <w:bottom w:type="dxa" w:w="80"/>
+              <w:right w:type="dxa" w:w="120"/>
+            </w:tcMar>
+          </w:tcPr>
+          <w:p>
+            <w:r>
+              <w:t xml:space="preserve">prettier / rustfmt / black / gofmt / swift-format by ext</w:t>
+            </w:r>
+          </w:p>
+        </w:tc>
+      </w:tr>
+    </w:tbl>
+    <w:p>
+      <w:pPr>
+        <w:pStyle w:val="Heading3"/>
+      </w:pPr>
+      <w:r>
+        <w:t xml:space="preserve">Background + control flow</w:t>
+      </w:r>
+    </w:p>
+    <w:tbl>
+      <w:tblPr>
+        <w:tblW w:type="dxa" w:w="9360"/>
+        <w:tblBorders>
+          <w:top w:val="single" w:color="auto" w:sz="4"/>
+          <w:left w:val="single" w:color="auto" w:sz="4"/>
+          <w:bottom w:val="single" w:color="auto" w:sz="4"/>
+          <w:right w:val="single" w:color="auto" w:sz="4"/>
+          <w:insideH w:val="single" w:color="auto" w:sz="4"/>
+          <w:insideV w:val="single" w:color="auto" w:sz="4"/>
+        </w:tblBorders>
+      </w:tblPr>
+      <w:tblGrid>
+        <w:gridCol w:w="2400"/>
+        <w:gridCol w:w="6960"/>
+      </w:tblGrid>
+      <w:tr>
+        <w:trPr>
+          <w:tblHeader/>
+        </w:trPr>
+        <w:tc>
+          <w:tcPr>
+            <w:tcW w:type="dxa" w:w="2400"/>
+            <w:tcBorders>
+              <w:top w:val="single" w:color="CCCCCC" w:sz="4"/>
+              <w:left w:val="single" w:color="CCCCCC" w:sz="4"/>
+              <w:bottom w:val="single" w:color="CCCCCC" w:sz="4"/>
+              <w:right w:val="single" w:color="CCCCCC" w:sz="4"/>
+            </w:tcBorders>
+            <w:shd w:fill="E5E7EB" w:val="clear"/>
+            <w:tcMar>
+              <w:top w:type="dxa" w:w="80"/>
+              <w:left w:type="dxa" w:w="120"/>
+              <w:bottom w:type="dxa" w:w="80"/>
+              <w:right w:type="dxa" w:w="120"/>
+            </w:tcMar>
+          </w:tcPr>
+          <w:p>
+            <w:r>
+              <w:rPr>
+                <w:b/>
+                <w:bCs/>
+              </w:rPr>
+              <w:t xml:space="preserve">Tool</w:t>
+            </w:r>
+          </w:p>
+        </w:tc>
+        <w:tc>
+          <w:tcPr>
+            <w:tcW w:type="dxa" w:w="6960"/>
+            <w:tcBorders>
+              <w:top w:val="single" w:color="CCCCCC" w:sz="4"/>
+              <w:left w:val="single" w:color="CCCCCC" w:sz="4"/>
+              <w:bottom w:val="single" w:color="CCCCCC" w:sz="4"/>
+              <w:right w:val="single" w:color="CCCCCC" w:sz="4"/>
+            </w:tcBorders>
+            <w:shd w:fill="E5E7EB" w:val="clear"/>
+            <w:tcMar>
+              <w:top w:type="dxa" w:w="80"/>
+              <w:left w:type="dxa" w:w="120"/>
+              <w:bottom w:type="dxa" w:w="80"/>
+              <w:right w:type="dxa" w:w="120"/>
+            </w:tcMar>
+          </w:tcPr>
+          <w:p>
+            <w:r>
+              <w:rPr>
+                <w:b/>
+                <w:bCs/>
+              </w:rPr>
+              <w:t xml:space="preserve">What it does</w:t>
+            </w:r>
+          </w:p>
+        </w:tc>
+      </w:tr>
+      <w:tr>
+        <w:tc>
+          <w:tcPr>
+            <w:tcW w:type="dxa" w:w="2400"/>
+            <w:tcBorders>
+              <w:top w:val="single" w:color="CCCCCC" w:sz="4"/>
+              <w:left w:val="single" w:color="CCCCCC" w:sz="4"/>
+              <w:bottom w:val="single" w:color="CCCCCC" w:sz="4"/>
+              <w:right w:val="single" w:color="CCCCCC" w:sz="4"/>
+            </w:tcBorders>
+            <w:tcMar>
+              <w:top w:type="dxa" w:w="80"/>
+              <w:left w:type="dxa" w:w="120"/>
+              <w:bottom w:type="dxa" w:w="80"/>
+              <w:right w:type="dxa" w:w="120"/>
+            </w:tcMar>
+          </w:tcPr>
+          <w:p>
+            <w:r>
+              <w:t xml:space="preserve">task_create</w:t>
+            </w:r>
+          </w:p>
+        </w:tc>
+        <w:tc>
+          <w:tcPr>
+            <w:tcW w:type="dxa" w:w="6960"/>
+            <w:tcBorders>
+              <w:top w:val="single" w:color="CCCCCC" w:sz="4"/>
+              <w:left w:val="single" w:color="CCCCCC" w:sz="4"/>
+              <w:bottom w:val="single" w:color="CCCCCC" w:sz="4"/>
+              <w:right w:val="single" w:color="CCCCCC" w:sz="4"/>
+            </w:tcBorders>
+            <w:tcMar>
+              <w:top w:type="dxa" w:w="80"/>
+              <w:left w:type="dxa" w:w="120"/>
+              <w:bottom w:type="dxa" w:w="80"/>
+              <w:right w:type="dxa" w:w="120"/>
+            </w:tcMar>
+          </w:tcPr>
+          <w:p>
+            <w:r>
+              <w:t xml:space="preserve">Start a background run_shell task; returns task_id</w:t>
+            </w:r>
+          </w:p>
+        </w:tc>
+      </w:tr>
+      <w:tr>
+        <w:tc>
+          <w:tcPr>
+            <w:tcW w:type="dxa" w:w="2400"/>
+            <w:tcBorders>
+              <w:top w:val="single" w:color="CCCCCC" w:sz="4"/>
+              <w:left w:val="single" w:color="CCCCCC" w:sz="4"/>
+              <w:bottom w:val="single" w:color="CCCCCC" w:sz="4"/>
+              <w:right w:val="single" w:color="CCCCCC" w:sz="4"/>
+            </w:tcBorders>
+            <w:tcMar>
+              <w:top w:type="dxa" w:w="80"/>
+              <w:left w:type="dxa" w:w="120"/>
+              <w:bottom w:type="dxa" w:w="80"/>
+              <w:right w:type="dxa" w:w="120"/>
+            </w:tcMar>
+          </w:tcPr>
+          <w:p>
+            <w:r>
+              <w:t xml:space="preserve">task_status / task_list / task_cancel</w:t>
+            </w:r>
+          </w:p>
+        </w:tc>
+        <w:tc>
+          <w:tcPr>
+            <w:tcW w:type="dxa" w:w="6960"/>
+            <w:tcBorders>
+              <w:top w:val="single" w:color="CCCCCC" w:sz="4"/>
+              <w:left w:val="single" w:color="CCCCCC" w:sz="4"/>
+              <w:bottom w:val="single" w:color="CCCCCC" w:sz="4"/>
+              <w:right w:val="single" w:color="CCCCCC" w:sz="4"/>
+            </w:tcBorders>
+            <w:tcMar>
+              <w:top w:type="dxa" w:w="80"/>
+              <w:left w:type="dxa" w:w="120"/>
+              <w:bottom w:type="dxa" w:w="80"/>
+              <w:right w:type="dxa" w:w="120"/>
+            </w:tcMar>
+          </w:tcPr>
+          <w:p>
+            <w:r>
+              <w:t xml:space="preserve">Inspect / cancel</w:t>
+            </w:r>
+          </w:p>
+        </w:tc>
+      </w:tr>
+      <w:tr>
+        <w:tc>
+          <w:tcPr>
+            <w:tcW w:type="dxa" w:w="2400"/>
+            <w:tcBorders>
+              <w:top w:val="single" w:color="CCCCCC" w:sz="4"/>
+              <w:left w:val="single" w:color="CCCCCC" w:sz="4"/>
+              <w:bottom w:val="single" w:color="CCCCCC" w:sz="4"/>
+              <w:right w:val="single" w:color="CCCCCC" w:sz="4"/>
+            </w:tcBorders>
+            <w:tcMar>
+              <w:top w:type="dxa" w:w="80"/>
+              <w:left w:type="dxa" w:w="120"/>
+              <w:bottom w:type="dxa" w:w="80"/>
+              <w:right w:type="dxa" w:w="120"/>
+            </w:tcMar>
+          </w:tcPr>
+          <w:p>
+            <w:r>
+              <w:t xml:space="preserve">ask_user</w:t>
+            </w:r>
+          </w:p>
+        </w:tc>
+        <w:tc>
+          <w:tcPr>
+            <w:tcW w:type="dxa" w:w="6960"/>
+            <w:tcBorders>
+              <w:top w:val="single" w:color="CCCCCC" w:sz="4"/>
+              <w:left w:val="single" w:color="CCCCCC" w:sz="4"/>
+              <w:bottom w:val="single" w:color="CCCCCC" w:sz="4"/>
+              <w:right w:val="single" w:color="CCCCCC" w:sz="4"/>
+            </w:tcBorders>
+            <w:tcMar>
+              <w:top w:type="dxa" w:w="80"/>
+              <w:left w:type="dxa" w:w="120"/>
+              <w:bottom w:type="dxa" w:w="80"/>
+              <w:right w:type="dxa" w:w="120"/>
+            </w:tcMar>
+          </w:tcPr>
+          <w:p>
+            <w:r>
+              <w:t xml:space="preserve">Pause + pop a modal; receive user's typed answer</w:t>
+            </w:r>
+          </w:p>
+        </w:tc>
+      </w:tr>
+      <w:tr>
+        <w:tc>
+          <w:tcPr>
+            <w:tcW w:type="dxa" w:w="2400"/>
+            <w:tcBorders>
+              <w:top w:val="single" w:color="CCCCCC" w:sz="4"/>
+              <w:left w:val="single" w:color="CCCCCC" w:sz="4"/>
+              <w:bottom w:val="single" w:color="CCCCCC" w:sz="4"/>
+              <w:right w:val="single" w:color="CCCCCC" w:sz="4"/>
+            </w:tcBorders>
+            <w:tcMar>
+              <w:top w:type="dxa" w:w="80"/>
+              <w:left w:type="dxa" w:w="120"/>
+              <w:bottom w:type="dxa" w:w="80"/>
+              <w:right w:type="dxa" w:w="120"/>
+            </w:tcMar>
+          </w:tcPr>
+          <w:p>
+            <w:r>
+              <w:t xml:space="preserve">spawn_subagent</w:t>
+            </w:r>
+          </w:p>
+        </w:tc>
+        <w:tc>
+          <w:tcPr>
+            <w:tcW w:type="dxa" w:w="6960"/>
+            <w:tcBorders>
+              <w:top w:val="single" w:color="CCCCCC" w:sz="4"/>
+              <w:left w:val="single" w:color="CCCCCC" w:sz="4"/>
+              <w:bottom w:val="single" w:color="CCCCCC" w:sz="4"/>
+              <w:right w:val="single" w:color="CCCCCC" w:sz="4"/>
+            </w:tcBorders>
+            <w:tcMar>
+              <w:top w:type="dxa" w:w="80"/>
+              <w:left w:type="dxa" w:w="120"/>
+              <w:bottom w:type="dxa" w:w="80"/>
+              <w:right w:type="dxa" w:w="120"/>
+            </w:tcMar>
+          </w:tcPr>
+          <w:p>
+            <w:r>
+              <w:t xml:space="preserve">Recursive agent run, depth-capped at 3</w:t>
             </w:r>
           </w:p>
         </w:tc>
@@ -1785,7 +3133,7 @@
           </w:tcPr>
           <w:p>
             <w:r>
-              <w:t xml:space="preserve">All</w:t>
+              <w:t xml:space="preserve">All 32 tools</w:t>
             </w:r>
           </w:p>
         </w:tc>
@@ -1853,7 +3201,7 @@
           </w:tcPr>
           <w:p>
             <w:r>
-              <w:t xml:space="preserve">read, list, search, exists, edit, write, run_shell</w:t>
+              <w:t xml:space="preserve">FS + shell + multi_edit + full git</w:t>
             </w:r>
           </w:p>
         </w:tc>
@@ -1921,7 +3269,7 @@
           </w:tcPr>
           <w:p>
             <w:r>
-              <w:t xml:space="preserve">read, list, search, exists</w:t>
+              <w:t xml:space="preserve">Read-only FS + git + web + read_pdf</w:t>
             </w:r>
           </w:p>
         </w:tc>
@@ -1943,7 +3291,7 @@
           </w:tcPr>
           <w:p>
             <w:r>
-              <w:t xml:space="preserve">Read-only investigation</w:t>
+              <w:t xml:space="preserve">Investigation without writes</w:t>
             </w:r>
           </w:p>
         </w:tc>

</xml_diff>

<commit_message>
docs: sync version refs + CHANGELOG to v0.9.3
- README badge 0.9.1 → 0.9.3.
- USER_GUIDE.md version line + DMG filename refs 0.9.1 → 0.9.3.
- Regenerated Froglips-User-Guide.docx title page for 0.9.3.
- CHANGELOG: backfilled [0.9.2] (clippy + looks_binary fix) and
  [0.9.3] (pen-test SSRF + injection + OOM fixes) entries that
  had landed without updating the file.
</commit_message>
<xml_diff>
--- a/docs/Froglips-User-Guide.docx
+++ b/docs/Froglips-User-Guide.docx
@@ -42,7 +42,7 @@
           <w:sz w:val="28"/>
           <w:szCs w:val="28"/>
         </w:rPr>
-        <w:t xml:space="preserve">Version 0.9.1</w:t>
+        <w:t xml:space="preserve">Version 0.9.3</w:t>
       </w:r>
     </w:p>
     <w:p>
@@ -106,7 +106,7 @@
         </w:numPr>
       </w:pPr>
       <w:r>
-        <w:t xml:space="preserve">Download Froglips_0.9.1_aarch64.dmg from the GitHub Releases page.</w:t>
+        <w:t xml:space="preserve">Download Froglips_0.9.3_aarch64.dmg from the GitHub Releases page.</w:t>
       </w:r>
     </w:p>
     <w:p>

</xml_diff>

<commit_message>
Update docs for the maturity work; add Tier C e2e specs
Refresh README, CHANGELOG, ARCHITECTURE, AGENT_LAYER, USER_GUIDE,
SECURITY, CONTRIBUTING, and RELEASE_PROCESS to cover the maturity
phases and tiers: native agent mode on all three backends, the
context-window manager, per-conversation model parameters, data
backup/export/import, conversation pin/tags/content-search, crash
logging and observability, DB corruption recovery, the migration
ladder, and release hardening. README now states the product
positioning — the local-LLM power workstation, three pillars (Agent,
Knowledge, Models). Regenerated the .docx user guide to match.

Also commits the Tier C end-to-end specs (mid-run tool denial,
dry-run) that were left untracked.
</commit_message>
<xml_diff>
--- a/docs/Froglips-User-Guide.docx
+++ b/docs/Froglips-User-Guide.docx
@@ -54,7 +54,7 @@
       <w:r>
         <w:t xml:space="preserve"> from the </w:t>
       </w:r>
-      <w:hyperlink w:history="1" r:id="rId2cer9rim7x6ojvaxc-wky">
+      <w:hyperlink w:history="1" r:id="rIdjiz4fhfg9hpdcpyh_gwkz">
         <w:r>
           <w:rPr>
             <w:rStyle w:val="Hyperlink"/>
@@ -1075,7 +1075,7 @@
         <w:spacing w:after="120"/>
       </w:pPr>
       <w:r>
-        <w:t xml:space="preserve">Froglips remembers things across conversations. There are four modes (set via the small ⓘ button next to the model name):</w:t>
+        <w:t xml:space="preserve">Froglips remembers things across conversations. There are four modes (set via the small ⓘ button next to the model name). The labels are plain-language; the behavior is unchanged from earlier versions:</w:t>
       </w:r>
     </w:p>
     <w:tbl>
@@ -1158,7 +1158,7 @@
                 <w:b/>
                 <w:bCs/>
               </w:rPr>
-              <w:t xml:space="preserve">off</w:t>
+              <w:t xml:space="preserve">Off</w:t>
             </w:r>
           </w:p>
         </w:tc>
@@ -1196,7 +1196,7 @@
                 <w:b/>
                 <w:bCs/>
               </w:rPr>
-              <w:t xml:space="preserve">manual</w:t>
+              <w:t xml:space="preserve">Suggest</w:t>
             </w:r>
           </w:p>
         </w:tc>
@@ -1234,23 +1234,23 @@
                 <w:b/>
                 <w:bCs/>
               </w:rPr>
-              <w:t xml:space="preserve">queue</w:t>
-            </w:r>
-          </w:p>
-        </w:tc>
-        <w:tc>
-          <w:tcPr>
-            <w:tcW w:type="dxa" w:w="4680"/>
-            <w:tcMar>
-              <w:top w:type="dxa" w:w="80"/>
-              <w:left w:type="dxa" w:w="120"/>
-              <w:bottom w:type="dxa" w:w="80"/>
-              <w:right w:type="dxa" w:w="120"/>
-            </w:tcMar>
-          </w:tcPr>
-          <w:p>
-            <w:r>
-              <w:t xml:space="preserve">Same as manual, plus automatically extracts facts after each turn into a </w:t>
+              <w:t xml:space="preserve">Review</w:t>
+            </w:r>
+          </w:p>
+        </w:tc>
+        <w:tc>
+          <w:tcPr>
+            <w:tcW w:type="dxa" w:w="4680"/>
+            <w:tcMar>
+              <w:top w:type="dxa" w:w="80"/>
+              <w:left w:type="dxa" w:w="120"/>
+              <w:bottom w:type="dxa" w:w="80"/>
+              <w:right w:type="dxa" w:w="120"/>
+            </w:tcMar>
+          </w:tcPr>
+          <w:p>
+            <w:r>
+              <w:t xml:space="preserve">Same as Suggest, plus automatically extracts facts after each turn into a </w:t>
             </w:r>
             <w:r>
               <w:rPr>
@@ -1282,23 +1282,23 @@
                 <w:b/>
                 <w:bCs/>
               </w:rPr>
-              <w:t xml:space="preserve">direct</w:t>
-            </w:r>
-          </w:p>
-        </w:tc>
-        <w:tc>
-          <w:tcPr>
-            <w:tcW w:type="dxa" w:w="4680"/>
-            <w:tcMar>
-              <w:top w:type="dxa" w:w="80"/>
-              <w:left w:type="dxa" w:w="120"/>
-              <w:bottom w:type="dxa" w:w="80"/>
-              <w:right w:type="dxa" w:w="120"/>
-            </w:tcMar>
-          </w:tcPr>
-          <w:p>
-            <w:r>
-              <w:t xml:space="preserve">Same as queue, but auto-approved into the active set. Most automatic.</w:t>
+              <w:t xml:space="preserve">Auto</w:t>
+            </w:r>
+          </w:p>
+        </w:tc>
+        <w:tc>
+          <w:tcPr>
+            <w:tcW w:type="dxa" w:w="4680"/>
+            <w:tcMar>
+              <w:top w:type="dxa" w:w="80"/>
+              <w:left w:type="dxa" w:w="120"/>
+              <w:bottom w:type="dxa" w:w="80"/>
+              <w:right w:type="dxa" w:w="120"/>
+            </w:tcMar>
+          </w:tcPr>
+          <w:p>
+            <w:r>
+              <w:t xml:space="preserve">Same as Review, but auto-approved into the active set. Most automatic.</w:t>
             </w:r>
           </w:p>
         </w:tc>
@@ -1439,9 +1439,10 @@
       </w:r>
       <w:r>
         <w:rPr>
-          <w:rFonts w:ascii="Courier New" w:cs="Courier New" w:eastAsia="Courier New" w:hAnsi="Courier New"/>
-        </w:rPr>
-        <w:t xml:space="preserve">queue</w:t>
+          <w:b/>
+          <w:bCs/>
+        </w:rPr>
+        <w:t xml:space="preserve">Review</w:t>
       </w:r>
       <w:r>
         <w:t xml:space="preserve"> mode)</w:t>
@@ -1478,66 +1479,23 @@
         <w:t xml:space="preserve">Agent</w:t>
       </w:r>
       <w:r>
-        <w:t xml:space="preserve"> button next to the chat input. Agent mode works on the</w:t>
-      </w:r>
-    </w:p>
-    <w:p>
-      <w:pPr>
-        <w:spacing w:after="120"/>
-      </w:pPr>
-      <w:r>
-        <w:rPr>
-          <w:b/>
-          <w:bCs/>
-        </w:rPr>
-        <w:t xml:space="preserve">Ollama</w:t>
-      </w:r>
-      <w:r>
-        <w:t xml:space="preserve"> and </w:t>
-      </w:r>
-      <w:r>
-        <w:rPr>
-          <w:b/>
-          <w:bCs/>
-        </w:rPr>
-        <w:t xml:space="preserve">MLX</w:t>
-      </w:r>
-      <w:r>
-        <w:t xml:space="preserve"> backends. The </w:t>
-      </w:r>
-      <w:r>
-        <w:rPr>
-          <w:b/>
-          <w:bCs/>
-        </w:rPr>
-        <w:t xml:space="preserve">Native</w:t>
-      </w:r>
-      <w:r>
-        <w:t xml:space="preserve"> backend has no tool-call</w:t>
-      </w:r>
-    </w:p>
-    <w:p>
-      <w:pPr>
-        <w:spacing w:after="120"/>
-      </w:pPr>
-      <w:r>
-        <w:t xml:space="preserve">support — turning Agent on while a native model is loaded shows a clear error</w:t>
-      </w:r>
-    </w:p>
-    <w:p>
-      <w:pPr>
-        <w:spacing w:after="120"/>
-      </w:pPr>
-      <w:r>
-        <w:t xml:space="preserve">instead of silently behaving like a plain chat. The Agent toggle also resets</w:t>
-      </w:r>
-    </w:p>
-    <w:p>
-      <w:pPr>
-        <w:spacing w:after="120"/>
-      </w:pPr>
-      <w:r>
-        <w:t xml:space="preserve">automatically if you switch to a backend that can't support it.</w:t>
+        <w:t xml:space="preserve"> button next to the chat input. **Agent mode works on all</w:t>
+      </w:r>
+    </w:p>
+    <w:p>
+      <w:pPr>
+        <w:spacing w:after="120"/>
+      </w:pPr>
+      <w:r>
+        <w:t xml:space="preserve">three backends — Ollama, MLX, and Native.** (Earlier versions limited it to</w:t>
+      </w:r>
+    </w:p>
+    <w:p>
+      <w:pPr>
+        <w:spacing w:after="120"/>
+      </w:pPr>
+      <w:r>
+        <w:t xml:space="preserve">Ollama and MLX; the Native backend now supports tool-calling too.)</w:t>
       </w:r>
     </w:p>
     <w:p>
@@ -3849,33 +3807,14 @@
         </w:numPr>
       </w:pPr>
       <w:r>
-        <w:t xml:space="preserve">Optional </w:t>
-      </w:r>
-      <w:r>
-        <w:rPr>
-          <w:b/>
-          <w:bCs/>
-        </w:rPr>
-        <w:t xml:space="preserve">workspace root</w:t>
-      </w:r>
-      <w:r>
-        <w:t xml:space="preserve"> confines all filesystem operations to a chosen directory. Set in agent settings (⚙).</w:t>
-      </w:r>
-    </w:p>
-    <w:p>
-      <w:pPr>
-        <w:pStyle w:val="Heading3"/>
-      </w:pPr>
-      <w:r>
-        <w:t xml:space="preserve">Agent settings (⚙)</w:t>
-      </w:r>
-    </w:p>
-    <w:p>
-      <w:pPr>
-        <w:spacing w:after="120"/>
-      </w:pPr>
-      <w:r>
-        <w:t xml:space="preserve">The cog button next to the Agent toggle opens a panel:</w:t>
+        <w:rPr>
+          <w:b/>
+          <w:bCs/>
+        </w:rPr>
+        <w:t xml:space="preserve">MCP server tools always require confirmation</w:t>
+      </w:r>
+      <w:r>
+        <w:t xml:space="preserve"> — they can't be auto-approved, even with a session "approve all" active.</w:t>
       </w:r>
     </w:p>
     <w:p>
@@ -3887,14 +3826,7 @@
         </w:numPr>
       </w:pPr>
       <w:r>
-        <w:rPr>
-          <w:b/>
-          <w:bCs/>
-        </w:rPr>
-        <w:t xml:space="preserve">Workspace</w:t>
-      </w:r>
-      <w:r>
-        <w:t xml:space="preserve"> — sets the sandbox root. Persisted across app restarts.</w:t>
+        <w:t xml:space="preserve">The agent loop manages the model's context window for you: on long runs it trims oversized tool results and summarizes the oldest turns so a small-context model doesn't overflow and forget its tools mid-task.</w:t>
       </w:r>
     </w:p>
     <w:p>
@@ -3906,14 +3838,7 @@
         </w:numPr>
       </w:pPr>
       <w:r>
-        <w:rPr>
-          <w:b/>
-          <w:bCs/>
-        </w:rPr>
-        <w:t xml:space="preserve">Approve all this session</w:t>
-      </w:r>
-      <w:r>
-        <w:t xml:space="preserve"> — bypass per-call confirmation for normal-risk shell or all writes.</w:t>
+        <w:t xml:space="preserve">If tool calls keep failing turn after turn, the agent stops with a clear message rather than burning its whole iteration budget retrying.</w:t>
       </w:r>
     </w:p>
     <w:p>
@@ -3925,14 +3850,33 @@
         </w:numPr>
       </w:pPr>
       <w:r>
-        <w:rPr>
-          <w:b/>
-          <w:bCs/>
-        </w:rPr>
-        <w:t xml:space="preserve">Allowed tools</w:t>
-      </w:r>
-      <w:r>
-        <w:t xml:space="preserve"> — restrict tools per conversation (overridden by preset when preset has its own allowlist).</w:t>
+        <w:t xml:space="preserve">Optional </w:t>
+      </w:r>
+      <w:r>
+        <w:rPr>
+          <w:b/>
+          <w:bCs/>
+        </w:rPr>
+        <w:t xml:space="preserve">workspace root</w:t>
+      </w:r>
+      <w:r>
+        <w:t xml:space="preserve"> confines all filesystem operations to a chosen directory. Set in agent settings (⚙).</w:t>
+      </w:r>
+    </w:p>
+    <w:p>
+      <w:pPr>
+        <w:pStyle w:val="Heading3"/>
+      </w:pPr>
+      <w:r>
+        <w:t xml:space="preserve">Agent settings (⚙)</w:t>
+      </w:r>
+    </w:p>
+    <w:p>
+      <w:pPr>
+        <w:spacing w:after="120"/>
+      </w:pPr>
+      <w:r>
+        <w:t xml:space="preserve">The cog button next to the Agent toggle opens a panel:</w:t>
       </w:r>
     </w:p>
     <w:p>
@@ -3948,19 +3892,10 @@
           <w:b/>
           <w:bCs/>
         </w:rPr>
-        <w:t xml:space="preserve">Approved shell prefixes</w:t>
-      </w:r>
-      <w:r>
-        <w:t xml:space="preserve"> — appears once you've checked "Also approve all </w:t>
-      </w:r>
-      <w:r>
-        <w:rPr>
-          <w:rFonts w:ascii="Courier New" w:cs="Courier New" w:eastAsia="Courier New" w:hAnsi="Courier New"/>
-        </w:rPr>
-        <w:t xml:space="preserve">&lt;cmd&gt; *</w:t>
-      </w:r>
-      <w:r>
-        <w:t xml:space="preserve">" on a confirm dialog.</w:t>
+        <w:t xml:space="preserve">Workspace</w:t>
+      </w:r>
+      <w:r>
+        <w:t xml:space="preserve"> — sets the sandbox root. Persisted across app restarts.</w:t>
       </w:r>
     </w:p>
     <w:p>
@@ -3976,59 +3911,10 @@
           <w:b/>
           <w:bCs/>
         </w:rPr>
-        <w:t xml:space="preserve">Updates</w:t>
-      </w:r>
-      <w:r>
-        <w:t xml:space="preserve"> — check for and install a new version.</w:t>
-      </w:r>
-    </w:p>
-    <w:p>
-      <w:pPr>
-        <w:pStyle w:val="Heading3"/>
-      </w:pPr>
-      <w:r>
-        <w:t xml:space="preserve">Metrics</w:t>
-      </w:r>
-    </w:p>
-    <w:p>
-      <w:pPr>
-        <w:spacing w:after="120"/>
-      </w:pPr>
-      <w:r>
-        <w:t xml:space="preserve">While the agent is running, a small pill shows </w:t>
-      </w:r>
-      <w:r>
-        <w:rPr>
-          <w:rFonts w:ascii="Courier New" w:cs="Courier New" w:eastAsia="Courier New" w:hAnsi="Courier New"/>
-        </w:rPr>
-        <w:t xml:space="preserve">i&lt;iters&gt;·t&lt;tools&gt;·llm&lt;ms&gt;·tool&lt;ms&gt;·r&lt;retries&gt;·&lt;prompt&gt;+&lt;completion&gt;tok</w:t>
-      </w:r>
-      <w:r>
-        <w:t xml:space="preserve">. Updates live.</w:t>
-      </w:r>
-    </w:p>
-    <w:p>
-      <w:pPr>
-        <w:pStyle w:val="Heading3"/>
-      </w:pPr>
-      <w:r>
-        <w:t xml:space="preserve">Tool history</w:t>
-      </w:r>
-    </w:p>
-    <w:p>
-      <w:pPr>
-        <w:spacing w:after="120"/>
-      </w:pPr>
-      <w:r>
-        <w:t xml:space="preserve">⌖ Tools button in the agent toolbar opens a slide-out panel listing every tool call in the current conversation with name, ok/err status badge, collapsible args + JSON result. Useful for debugging agent runs.</w:t>
-      </w:r>
-    </w:p>
-    <w:p>
-      <w:pPr>
-        <w:pStyle w:val="Heading2"/>
-      </w:pPr>
-      <w:r>
-        <w:t xml:space="preserve">7. Conversation search + export</w:t>
+        <w:t xml:space="preserve">Approve all this session</w:t>
+      </w:r>
+      <w:r>
+        <w:t xml:space="preserve"> — bypass per-call confirmation for normal-risk shell or all writes.</w:t>
       </w:r>
     </w:p>
     <w:p>
@@ -4044,10 +3930,10 @@
           <w:b/>
           <w:bCs/>
         </w:rPr>
-        <w:t xml:space="preserve">Search</w:t>
-      </w:r>
-      <w:r>
-        <w:t xml:space="preserve">: search input at the top of the sidebar filters conversations by title substring.</w:t>
+        <w:t xml:space="preserve">Allowed tools</w:t>
+      </w:r>
+      <w:r>
+        <w:t xml:space="preserve"> — restrict tools per conversation (overridden by preset when preset has its own allowlist).</w:t>
       </w:r>
     </w:p>
     <w:p>
@@ -4063,10 +3949,19 @@
           <w:b/>
           <w:bCs/>
         </w:rPr>
-        <w:t xml:space="preserve">Export</w:t>
-      </w:r>
-      <w:r>
-        <w:t xml:space="preserve">: ⤓ Export button in the agent toolbar saves the current conversation as Markdown (timestamps, model tags, tool calls + results included).</w:t>
+        <w:t xml:space="preserve">Approved shell prefixes</w:t>
+      </w:r>
+      <w:r>
+        <w:t xml:space="preserve"> — appears once you've checked "Also approve all </w:t>
+      </w:r>
+      <w:r>
+        <w:rPr>
+          <w:rFonts w:ascii="Courier New" w:cs="Courier New" w:eastAsia="Courier New" w:hAnsi="Courier New"/>
+        </w:rPr>
+        <w:t xml:space="preserve">&lt;cmd&gt; *</w:t>
+      </w:r>
+      <w:r>
+        <w:t xml:space="preserve">" on a confirm dialog.</w:t>
       </w:r>
     </w:p>
     <w:p>
@@ -4082,10 +3977,51 @@
           <w:b/>
           <w:bCs/>
         </w:rPr>
-        <w:t xml:space="preserve">Per-message actions</w:t>
-      </w:r>
-      <w:r>
-        <w:t xml:space="preserve">: hover any message — Copy (clipboard), Regenerate (assistant only, deletes the prior pair and re-asks), Edit (user only — drafts your last prompt back into the input so you can change it and resend).</w:t>
+        <w:t xml:space="preserve">Updates</w:t>
+      </w:r>
+      <w:r>
+        <w:t xml:space="preserve"> — check for and install a new version.</w:t>
+      </w:r>
+    </w:p>
+    <w:p>
+      <w:pPr>
+        <w:pStyle w:val="Heading3"/>
+      </w:pPr>
+      <w:r>
+        <w:t xml:space="preserve">Metrics</w:t>
+      </w:r>
+    </w:p>
+    <w:p>
+      <w:pPr>
+        <w:spacing w:after="120"/>
+      </w:pPr>
+      <w:r>
+        <w:t xml:space="preserve">While the agent is running, a small pill shows </w:t>
+      </w:r>
+      <w:r>
+        <w:rPr>
+          <w:rFonts w:ascii="Courier New" w:cs="Courier New" w:eastAsia="Courier New" w:hAnsi="Courier New"/>
+        </w:rPr>
+        <w:t xml:space="preserve">i&lt;iters&gt;·t&lt;tools&gt;·llm&lt;ms&gt;·tool&lt;ms&gt;·r&lt;retries&gt;·&lt;prompt&gt;+&lt;completion&gt;tok</w:t>
+      </w:r>
+      <w:r>
+        <w:t xml:space="preserve">. Updates live.</w:t>
+      </w:r>
+    </w:p>
+    <w:p>
+      <w:pPr>
+        <w:pStyle w:val="Heading3"/>
+      </w:pPr>
+      <w:r>
+        <w:t xml:space="preserve">Tool history</w:t>
+      </w:r>
+    </w:p>
+    <w:p>
+      <w:pPr>
+        <w:spacing w:after="120"/>
+      </w:pPr>
+      <w:r>
+        <w:t xml:space="preserve">⌖ Tools button in the agent toolbar opens a slide-out panel listing every tool call in the current conversation with name, ok/err status badge, collapsible args + JSON result. Useful for debugging agent runs.</w:t>
       </w:r>
     </w:p>
     <w:p>
@@ -4093,7 +4029,23 @@
         <w:pStyle w:val="Heading2"/>
       </w:pPr>
       <w:r>
-        <w:t xml:space="preserve">8. Themes + keyboard shortcuts</w:t>
+        <w:t xml:space="preserve">7. Per-conversation model parameters</w:t>
+      </w:r>
+    </w:p>
+    <w:p>
+      <w:pPr>
+        <w:spacing w:after="120"/>
+      </w:pPr>
+      <w:r>
+        <w:t xml:space="preserve">Each conversation can carry its own model-parameter overrides. Open the params</w:t>
+      </w:r>
+    </w:p>
+    <w:p>
+      <w:pPr>
+        <w:spacing w:after="120"/>
+      </w:pPr>
+      <w:r>
+        <w:t xml:space="preserve">panel (the sliders/⚙-style control by the composer) to set any of:</w:t>
       </w:r>
     </w:p>
     <w:p>
@@ -4105,17 +4057,31 @@
         </w:numPr>
       </w:pPr>
       <w:r>
-        <w:t xml:space="preserve">☀/☾ in sidebar toggles </w:t>
-      </w:r>
-      <w:r>
-        <w:rPr>
-          <w:b/>
-          <w:bCs/>
-        </w:rPr>
-        <w:t xml:space="preserve">light/dark theme</w:t>
-      </w:r>
-      <w:r>
-        <w:t xml:space="preserve">. Persisted across restarts.</w:t>
+        <w:rPr>
+          <w:b/>
+          <w:bCs/>
+        </w:rPr>
+        <w:t xml:space="preserve">Temperature</w:t>
+      </w:r>
+      <w:r>
+        <w:t xml:space="preserve">, </w:t>
+      </w:r>
+      <w:r>
+        <w:rPr>
+          <w:b/>
+          <w:bCs/>
+        </w:rPr>
+        <w:t xml:space="preserve">top-p</w:t>
+      </w:r>
+      <w:r>
+        <w:t xml:space="preserve">, </w:t>
+      </w:r>
+      <w:r>
+        <w:rPr>
+          <w:b/>
+          <w:bCs/>
+        </w:rPr>
+        <w:t xml:space="preserve">max tokens</w:t>
       </w:r>
     </w:p>
     <w:p>
@@ -4127,14 +4093,72 @@
         </w:numPr>
       </w:pPr>
       <w:r>
-        <w:rPr>
-          <w:b/>
-          <w:bCs/>
-        </w:rPr>
-        <w:t xml:space="preserve">Sidebar collapse</w:t>
-      </w:r>
-      <w:r>
-        <w:t xml:space="preserve">: a collapse/expand toggle hides the conversation sidebar to give the chat full width. State is remembered.</w:t>
+        <w:t xml:space="preserve">A conversation-specific </w:t>
+      </w:r>
+      <w:r>
+        <w:rPr>
+          <w:b/>
+          <w:bCs/>
+        </w:rPr>
+        <w:t xml:space="preserve">system prompt</w:t>
+      </w:r>
+    </w:p>
+    <w:p>
+      <w:pPr>
+        <w:spacing w:after="120"/>
+      </w:pPr>
+      <w:r>
+        <w:t xml:space="preserve">Every field is optional — leave one blank and that conversation uses the</w:t>
+      </w:r>
+    </w:p>
+    <w:p>
+      <w:pPr>
+        <w:spacing w:after="120"/>
+      </w:pPr>
+      <w:r>
+        <w:t xml:space="preserve">backend default, exactly as before. Parameters apply on all three backends.</w:t>
+      </w:r>
+    </w:p>
+    <w:p>
+      <w:pPr>
+        <w:spacing w:after="120"/>
+      </w:pPr>
+      <w:r>
+        <w:t xml:space="preserve">A small </w:t>
+      </w:r>
+      <w:r>
+        <w:rPr>
+          <w:b/>
+          <w:bCs/>
+        </w:rPr>
+        <w:t xml:space="preserve">context-usage meter</w:t>
+      </w:r>
+      <w:r>
+        <w:t xml:space="preserve"> sits by the composer, showing how much of the</w:t>
+      </w:r>
+    </w:p>
+    <w:p>
+      <w:pPr>
+        <w:spacing w:after="120"/>
+      </w:pPr>
+      <w:r>
+        <w:t xml:space="preserve">model's context window the current conversation is using so you can see when</w:t>
+      </w:r>
+    </w:p>
+    <w:p>
+      <w:pPr>
+        <w:spacing w:after="120"/>
+      </w:pPr>
+      <w:r>
+        <w:t xml:space="preserve">you're approaching the limit.</w:t>
+      </w:r>
+    </w:p>
+    <w:p>
+      <w:pPr>
+        <w:pStyle w:val="Heading2"/>
+      </w:pPr>
+      <w:r>
+        <w:t xml:space="preserve">8. Organizing conversations</w:t>
       </w:r>
     </w:p>
     <w:p>
@@ -4150,10 +4174,26 @@
           <w:b/>
           <w:bCs/>
         </w:rPr>
-        <w:t xml:space="preserve">Markdown rendering</w:t>
-      </w:r>
-      <w:r>
-        <w:t xml:space="preserve">: assistant + user messages render Markdown with code-block syntax highlighting for 20+ languages.</w:t>
+        <w:t xml:space="preserve">Auto-titling</w:t>
+      </w:r>
+      <w:r>
+        <w:t xml:space="preserve">: a new conversation is automatically titled from your first</w:t>
+      </w:r>
+    </w:p>
+    <w:p>
+      <w:pPr>
+        <w:spacing w:after="120"/>
+      </w:pPr>
+      <w:r>
+        <w:t xml:space="preserve">  message, so the sidebar reads as real titles instead of a wall of</w:t>
+      </w:r>
+    </w:p>
+    <w:p>
+      <w:pPr>
+        <w:spacing w:after="120"/>
+      </w:pPr>
+      <w:r>
+        <w:t xml:space="preserve">  "New chat".</w:t>
       </w:r>
     </w:p>
     <w:p>
@@ -4169,10 +4209,18 @@
           <w:b/>
           <w:bCs/>
         </w:rPr>
-        <w:t xml:space="preserve">Citation chips</w:t>
-      </w:r>
-      <w:r>
-        <w:t xml:space="preserve">: when the agent references a workspace file, the chip is clickable — Froglips confirms the resolved path and opens it. Opens are confined to the workspace root; absolute or traversal paths are rejected.</w:t>
+        <w:t xml:space="preserve">Pin</w:t>
+      </w:r>
+      <w:r>
+        <w:t xml:space="preserve">: pin important conversations from the row's hover controls; pinned</w:t>
+      </w:r>
+    </w:p>
+    <w:p>
+      <w:pPr>
+        <w:spacing w:after="120"/>
+      </w:pPr>
+      <w:r>
+        <w:t xml:space="preserve">  conversations sort to the top of the sidebar.</w:t>
       </w:r>
     </w:p>
     <w:p>
@@ -4184,7 +4232,22 @@
         </w:numPr>
       </w:pPr>
       <w:r>
-        <w:t xml:space="preserve">Cmd+N — new chat</w:t>
+        <w:rPr>
+          <w:b/>
+          <w:bCs/>
+        </w:rPr>
+        <w:t xml:space="preserve">Tags</w:t>
+      </w:r>
+      <w:r>
+        <w:t xml:space="preserve">: tag conversations from the same hover controls to group related</w:t>
+      </w:r>
+    </w:p>
+    <w:p>
+      <w:pPr>
+        <w:spacing w:after="120"/>
+      </w:pPr>
+      <w:r>
+        <w:t xml:space="preserve">  work.</w:t>
       </w:r>
     </w:p>
     <w:p>
@@ -4196,7 +4259,32 @@
         </w:numPr>
       </w:pPr>
       <w:r>
-        <w:t xml:space="preserve">Cmd+L — open model library</w:t>
+        <w:rPr>
+          <w:b/>
+          <w:bCs/>
+        </w:rPr>
+        <w:t xml:space="preserve">Search</w:t>
+      </w:r>
+      <w:r>
+        <w:t xml:space="preserve">: the sidebar search field now searches </w:t>
+      </w:r>
+      <w:r>
+        <w:rPr>
+          <w:b/>
+          <w:bCs/>
+        </w:rPr>
+        <w:t xml:space="preserve">message content</w:t>
+      </w:r>
+      <w:r>
+        <w:t xml:space="preserve">, not</w:t>
+      </w:r>
+    </w:p>
+    <w:p>
+      <w:pPr>
+        <w:spacing w:after="120"/>
+      </w:pPr>
+      <w:r>
+        <w:t xml:space="preserve">  just titles — so you can find a conversation by something said inside it.</w:t>
       </w:r>
     </w:p>
     <w:p>
@@ -4208,7 +4296,40 @@
         </w:numPr>
       </w:pPr>
       <w:r>
-        <w:t xml:space="preserve">Cmd+K — focus model picker</w:t>
+        <w:rPr>
+          <w:b/>
+          <w:bCs/>
+        </w:rPr>
+        <w:t xml:space="preserve">Undo delete</w:t>
+      </w:r>
+      <w:r>
+        <w:t xml:space="preserve">: deleting a conversation shows a 5-second undo toast. Click</w:t>
+      </w:r>
+    </w:p>
+    <w:p>
+      <w:pPr>
+        <w:spacing w:after="120"/>
+      </w:pPr>
+      <w:r>
+        <w:t xml:space="preserve">  </w:t>
+      </w:r>
+      <w:r>
+        <w:rPr>
+          <w:b/>
+          <w:bCs/>
+        </w:rPr>
+        <w:t xml:space="preserve">Undo</w:t>
+      </w:r>
+      <w:r>
+        <w:t xml:space="preserve"> and the conversation and all its messages come back; ignore it and</w:t>
+      </w:r>
+    </w:p>
+    <w:p>
+      <w:pPr>
+        <w:spacing w:after="120"/>
+      </w:pPr>
+      <w:r>
+        <w:t xml:space="preserve">  the delete finalizes.</w:t>
       </w:r>
     </w:p>
     <w:p>
@@ -4216,47 +4337,7 @@
         <w:pStyle w:val="Heading2"/>
       </w:pPr>
       <w:r>
-        <w:t xml:space="preserve">9. Voice input</w:t>
-      </w:r>
-    </w:p>
-    <w:p>
-      <w:pPr>
-        <w:spacing w:after="120"/>
-      </w:pPr>
-      <w:r>
-        <w:t xml:space="preserve">Click the microphone icon next to the chat input. Uses Web Speech API. Speak, then click again to stop. Manual edits while listening are preserved — the transcript rebases around them.</w:t>
-      </w:r>
-    </w:p>
-    <w:p>
-      <w:pPr>
-        <w:pStyle w:val="Heading2"/>
-      </w:pPr>
-      <w:r>
-        <w:t xml:space="preserve">10. File drag-drop</w:t>
-      </w:r>
-    </w:p>
-    <w:p>
-      <w:pPr>
-        <w:spacing w:after="120"/>
-      </w:pPr>
-      <w:r>
-        <w:t xml:space="preserve">Drag any text file into the chat input area. Its path gets attached. The model sees the path in context. Total attached bytes capped at 1 MiB per turn.</w:t>
-      </w:r>
-    </w:p>
-    <w:p>
-      <w:pPr>
-        <w:pStyle w:val="Heading2"/>
-      </w:pPr>
-      <w:r>
-        <w:t xml:space="preserve">11. Updates</w:t>
-      </w:r>
-    </w:p>
-    <w:p>
-      <w:pPr>
-        <w:spacing w:after="120"/>
-      </w:pPr>
-      <w:r>
-        <w:t xml:space="preserve">Two ways to get a new version:</w:t>
+        <w:t xml:space="preserve">9. Conversation export + per-message actions</w:t>
       </w:r>
     </w:p>
     <w:p>
@@ -4272,20 +4353,10 @@
           <w:b/>
           <w:bCs/>
         </w:rPr>
-        <w:t xml:space="preserve">In-app</w:t>
-      </w:r>
-      <w:r>
-        <w:t xml:space="preserve">: Agent settings ⚙ → </w:t>
-      </w:r>
-      <w:r>
-        <w:rPr>
-          <w:b/>
-          <w:bCs/>
-        </w:rPr>
-        <w:t xml:space="preserve">Check now</w:t>
-      </w:r>
-      <w:r>
-        <w:t xml:space="preserve">. Downloads, installs, relaunches.</w:t>
+        <w:t xml:space="preserve">Export</w:t>
+      </w:r>
+      <w:r>
+        <w:t xml:space="preserve">: ⤓ Export button in the agent toolbar saves the current conversation as Markdown (timestamps, model tags, tool calls + results included).</w:t>
       </w:r>
     </w:p>
     <w:p>
@@ -4301,6 +4372,483 @@
           <w:b/>
           <w:bCs/>
         </w:rPr>
+        <w:t xml:space="preserve">Per-message actions</w:t>
+      </w:r>
+      <w:r>
+        <w:t xml:space="preserve">: hover any message — Copy (clipboard), Regenerate (assistant only, deletes the prior pair and re-asks), Edit (user only — drafts your last prompt back into the input so you can change it and resend).</w:t>
+      </w:r>
+    </w:p>
+    <w:p>
+      <w:pPr>
+        <w:pStyle w:val="Heading2"/>
+      </w:pPr>
+      <w:r>
+        <w:t xml:space="preserve">10. Themes + keyboard shortcuts</w:t>
+      </w:r>
+    </w:p>
+    <w:p>
+      <w:pPr>
+        <w:pStyle w:val="ListParagraph"/>
+        <w:numPr>
+          <w:ilvl w:val="0"/>
+          <w:numId w:val="3"/>
+        </w:numPr>
+      </w:pPr>
+      <w:r>
+        <w:t xml:space="preserve">☀/☾ in sidebar toggles </w:t>
+      </w:r>
+      <w:r>
+        <w:rPr>
+          <w:b/>
+          <w:bCs/>
+        </w:rPr>
+        <w:t xml:space="preserve">light/dark theme</w:t>
+      </w:r>
+      <w:r>
+        <w:t xml:space="preserve">. Persisted across restarts.</w:t>
+      </w:r>
+    </w:p>
+    <w:p>
+      <w:pPr>
+        <w:pStyle w:val="ListParagraph"/>
+        <w:numPr>
+          <w:ilvl w:val="0"/>
+          <w:numId w:val="3"/>
+        </w:numPr>
+      </w:pPr>
+      <w:r>
+        <w:rPr>
+          <w:b/>
+          <w:bCs/>
+        </w:rPr>
+        <w:t xml:space="preserve">Sidebar collapse</w:t>
+      </w:r>
+      <w:r>
+        <w:t xml:space="preserve">: a collapse/expand toggle hides the conversation sidebar to give the chat full width. State is remembered.</w:t>
+      </w:r>
+    </w:p>
+    <w:p>
+      <w:pPr>
+        <w:pStyle w:val="ListParagraph"/>
+        <w:numPr>
+          <w:ilvl w:val="0"/>
+          <w:numId w:val="3"/>
+        </w:numPr>
+      </w:pPr>
+      <w:r>
+        <w:rPr>
+          <w:b/>
+          <w:bCs/>
+        </w:rPr>
+        <w:t xml:space="preserve">Markdown rendering</w:t>
+      </w:r>
+      <w:r>
+        <w:t xml:space="preserve">: assistant + user messages render Markdown with code-block syntax highlighting for 20+ languages.</w:t>
+      </w:r>
+    </w:p>
+    <w:p>
+      <w:pPr>
+        <w:pStyle w:val="ListParagraph"/>
+        <w:numPr>
+          <w:ilvl w:val="0"/>
+          <w:numId w:val="3"/>
+        </w:numPr>
+      </w:pPr>
+      <w:r>
+        <w:rPr>
+          <w:b/>
+          <w:bCs/>
+        </w:rPr>
+        <w:t xml:space="preserve">Citation chips</w:t>
+      </w:r>
+      <w:r>
+        <w:t xml:space="preserve">: when the agent references a workspace file, the chip is clickable — Froglips confirms the resolved path and opens it. Opens are confined to the workspace root; absolute or traversal paths are rejected.</w:t>
+      </w:r>
+    </w:p>
+    <w:p>
+      <w:pPr>
+        <w:pStyle w:val="ListParagraph"/>
+        <w:numPr>
+          <w:ilvl w:val="0"/>
+          <w:numId w:val="3"/>
+        </w:numPr>
+      </w:pPr>
+      <w:r>
+        <w:rPr>
+          <w:b/>
+          <w:bCs/>
+        </w:rPr>
+        <w:t xml:space="preserve">Scroll behavior</w:t>
+      </w:r>
+      <w:r>
+        <w:t xml:space="preserve">: the chat sticks to the bottom while a reply streams, but if you scroll up to read, autoscroll pauses so you aren't yanked back down — it resumes when you return to the bottom.</w:t>
+      </w:r>
+    </w:p>
+    <w:p>
+      <w:pPr>
+        <w:pStyle w:val="ListParagraph"/>
+        <w:numPr>
+          <w:ilvl w:val="0"/>
+          <w:numId w:val="3"/>
+        </w:numPr>
+      </w:pPr>
+      <w:r>
+        <w:rPr>
+          <w:b/>
+          <w:bCs/>
+        </w:rPr>
+        <w:t xml:space="preserve">Empty-chat landing</w:t>
+      </w:r>
+      <w:r>
+        <w:t xml:space="preserve">: a brand-new chat shows clickable example prompts instead of a blank surface; click one to drop it into the composer.</w:t>
+      </w:r>
+    </w:p>
+    <w:p>
+      <w:pPr>
+        <w:pStyle w:val="ListParagraph"/>
+        <w:numPr>
+          <w:ilvl w:val="0"/>
+          <w:numId w:val="3"/>
+        </w:numPr>
+      </w:pPr>
+      <w:r>
+        <w:rPr>
+          <w:b/>
+          <w:bCs/>
+        </w:rPr>
+        <w:t xml:space="preserve">Reduced motion</w:t>
+      </w:r>
+      <w:r>
+        <w:t xml:space="preserve">: entrance animations are disabled when your system "reduce motion" setting is on.</w:t>
+      </w:r>
+    </w:p>
+    <w:p>
+      <w:pPr>
+        <w:pStyle w:val="ListParagraph"/>
+        <w:numPr>
+          <w:ilvl w:val="0"/>
+          <w:numId w:val="3"/>
+        </w:numPr>
+      </w:pPr>
+      <w:r>
+        <w:t xml:space="preserve">Cmd+N — new chat</w:t>
+      </w:r>
+    </w:p>
+    <w:p>
+      <w:pPr>
+        <w:pStyle w:val="ListParagraph"/>
+        <w:numPr>
+          <w:ilvl w:val="0"/>
+          <w:numId w:val="3"/>
+        </w:numPr>
+      </w:pPr>
+      <w:r>
+        <w:t xml:space="preserve">Cmd+L — open model library</w:t>
+      </w:r>
+    </w:p>
+    <w:p>
+      <w:pPr>
+        <w:pStyle w:val="ListParagraph"/>
+        <w:numPr>
+          <w:ilvl w:val="0"/>
+          <w:numId w:val="3"/>
+        </w:numPr>
+      </w:pPr>
+      <w:r>
+        <w:t xml:space="preserve">Cmd+K — focus model picker</w:t>
+      </w:r>
+    </w:p>
+    <w:p>
+      <w:pPr>
+        <w:pStyle w:val="Heading2"/>
+      </w:pPr>
+      <w:r>
+        <w:t xml:space="preserve">11. Voice input</w:t>
+      </w:r>
+    </w:p>
+    <w:p>
+      <w:pPr>
+        <w:spacing w:after="120"/>
+      </w:pPr>
+      <w:r>
+        <w:t xml:space="preserve">Click the microphone icon next to the chat input. Uses Web Speech API. Speak, then click again to stop. Manual edits while listening are preserved — the transcript rebases around them. Recognized speech segments are joined with proper spacing.</w:t>
+      </w:r>
+    </w:p>
+    <w:p>
+      <w:pPr>
+        <w:pStyle w:val="Heading2"/>
+      </w:pPr>
+      <w:r>
+        <w:t xml:space="preserve">12. File drag-drop</w:t>
+      </w:r>
+    </w:p>
+    <w:p>
+      <w:pPr>
+        <w:spacing w:after="120"/>
+      </w:pPr>
+      <w:r>
+        <w:t xml:space="preserve">Drag any text file into the chat input area. Its path gets attached. The model sees the path in context. Total attached bytes capped at 1 MiB per turn.</w:t>
+      </w:r>
+    </w:p>
+    <w:p>
+      <w:pPr>
+        <w:pStyle w:val="Heading2"/>
+      </w:pPr>
+      <w:r>
+        <w:t xml:space="preserve">13. Diagnostics, backup, and crash logs</w:t>
+      </w:r>
+    </w:p>
+    <w:p>
+      <w:pPr>
+        <w:spacing w:after="120"/>
+      </w:pPr>
+      <w:r>
+        <w:t xml:space="preserve">Open the </w:t>
+      </w:r>
+      <w:r>
+        <w:rPr>
+          <w:b/>
+          <w:bCs/>
+        </w:rPr>
+        <w:t xml:space="preserve">Diagnostics</w:t>
+      </w:r>
+      <w:r>
+        <w:t xml:space="preserve"> panel from the menu.</w:t>
+      </w:r>
+    </w:p>
+    <w:p>
+      <w:pPr>
+        <w:pStyle w:val="ListParagraph"/>
+        <w:numPr>
+          <w:ilvl w:val="0"/>
+          <w:numId w:val="3"/>
+        </w:numPr>
+      </w:pPr>
+      <w:r>
+        <w:rPr>
+          <w:b/>
+          <w:bCs/>
+        </w:rPr>
+        <w:t xml:space="preserve">Crash log</w:t>
+      </w:r>
+      <w:r>
+        <w:t xml:space="preserve">: if Froglips ever panics, the crash is recorded to</w:t>
+      </w:r>
+    </w:p>
+    <w:p>
+      <w:pPr>
+        <w:spacing w:after="120"/>
+      </w:pPr>
+      <w:r>
+        <w:t xml:space="preserve">  </w:t>
+      </w:r>
+      <w:r>
+        <w:rPr>
+          <w:rFonts w:ascii="Courier New" w:cs="Courier New" w:eastAsia="Courier New" w:hAnsi="Courier New"/>
+        </w:rPr>
+        <w:t xml:space="preserve">~/.local-llm-app/crash.log</w:t>
+      </w:r>
+      <w:r>
+        <w:t xml:space="preserve">. The Diagnostics panel has a refreshable</w:t>
+      </w:r>
+    </w:p>
+    <w:p>
+      <w:pPr>
+        <w:spacing w:after="120"/>
+      </w:pPr>
+      <w:r>
+        <w:t xml:space="preserve">  crash-log section showing recorded panics (or an empty state when there are</w:t>
+      </w:r>
+    </w:p>
+    <w:p>
+      <w:pPr>
+        <w:spacing w:after="120"/>
+      </w:pPr>
+      <w:r>
+        <w:t xml:space="preserve">  none). Everything stays on disk — there is no telemetry.</w:t>
+      </w:r>
+    </w:p>
+    <w:p>
+      <w:pPr>
+        <w:pStyle w:val="ListParagraph"/>
+        <w:numPr>
+          <w:ilvl w:val="0"/>
+          <w:numId w:val="3"/>
+        </w:numPr>
+      </w:pPr>
+      <w:r>
+        <w:rPr>
+          <w:b/>
+          <w:bCs/>
+        </w:rPr>
+        <w:t xml:space="preserve">Diagnostics bundle</w:t>
+      </w:r>
+      <w:r>
+        <w:t xml:space="preserve">: export a single archive (logs + crash log + redacted</w:t>
+      </w:r>
+    </w:p>
+    <w:p>
+      <w:pPr>
+        <w:spacing w:after="120"/>
+      </w:pPr>
+      <w:r>
+        <w:t xml:space="preserve">  settings + version info) to attach to a bug report. API keys and other</w:t>
+      </w:r>
+    </w:p>
+    <w:p>
+      <w:pPr>
+        <w:spacing w:after="120"/>
+      </w:pPr>
+      <w:r>
+        <w:t xml:space="preserve">  secrets are redacted before it is written.</w:t>
+      </w:r>
+    </w:p>
+    <w:p>
+      <w:pPr>
+        <w:pStyle w:val="ListParagraph"/>
+        <w:numPr>
+          <w:ilvl w:val="0"/>
+          <w:numId w:val="3"/>
+        </w:numPr>
+      </w:pPr>
+      <w:r>
+        <w:rPr>
+          <w:b/>
+          <w:bCs/>
+        </w:rPr>
+        <w:t xml:space="preserve">Data backup</w:t>
+      </w:r>
+      <w:r>
+        <w:t xml:space="preserve">: take an online backup of the conversation database.</w:t>
+      </w:r>
+    </w:p>
+    <w:p>
+      <w:pPr>
+        <w:pStyle w:val="ListParagraph"/>
+        <w:numPr>
+          <w:ilvl w:val="0"/>
+          <w:numId w:val="3"/>
+        </w:numPr>
+      </w:pPr>
+      <w:r>
+        <w:rPr>
+          <w:b/>
+          <w:bCs/>
+        </w:rPr>
+        <w:t xml:space="preserve">Export / import</w:t>
+      </w:r>
+      <w:r>
+        <w:t xml:space="preserve">: export your conversations, messages, and memory to a</w:t>
+      </w:r>
+    </w:p>
+    <w:p>
+      <w:pPr>
+        <w:spacing w:after="120"/>
+      </w:pPr>
+      <w:r>
+        <w:t xml:space="preserve">  versioned JSON file, and import one back. Import is </w:t>
+      </w:r>
+      <w:r>
+        <w:rPr>
+          <w:b/>
+          <w:bCs/>
+        </w:rPr>
+        <w:t xml:space="preserve">additive</w:t>
+      </w:r>
+      <w:r>
+        <w:t xml:space="preserve"> — it merges</w:t>
+      </w:r>
+    </w:p>
+    <w:p>
+      <w:pPr>
+        <w:spacing w:after="120"/>
+      </w:pPr>
+      <w:r>
+        <w:t xml:space="preserve">  into your existing data inside a transaction rather than overwriting it.</w:t>
+      </w:r>
+    </w:p>
+    <w:p>
+      <w:pPr>
+        <w:spacing w:after="120"/>
+      </w:pPr>
+      <w:r>
+        <w:t xml:space="preserve">Your data also self-protects: on startup Froglips integrity-checks the</w:t>
+      </w:r>
+    </w:p>
+    <w:p>
+      <w:pPr>
+        <w:spacing w:after="120"/>
+      </w:pPr>
+      <w:r>
+        <w:t xml:space="preserve">database and, if it finds corruption, quarantines the bad file and starts</w:t>
+      </w:r>
+    </w:p>
+    <w:p>
+      <w:pPr>
+        <w:spacing w:after="120"/>
+      </w:pPr>
+      <w:r>
+        <w:t xml:space="preserve">fresh instead of failing to launch.</w:t>
+      </w:r>
+    </w:p>
+    <w:p>
+      <w:pPr>
+        <w:pStyle w:val="Heading2"/>
+      </w:pPr>
+      <w:r>
+        <w:t xml:space="preserve">14. Updates</w:t>
+      </w:r>
+    </w:p>
+    <w:p>
+      <w:pPr>
+        <w:spacing w:after="120"/>
+      </w:pPr>
+      <w:r>
+        <w:t xml:space="preserve">Two ways to get a new version:</w:t>
+      </w:r>
+    </w:p>
+    <w:p>
+      <w:pPr>
+        <w:pStyle w:val="ListParagraph"/>
+        <w:numPr>
+          <w:ilvl w:val="0"/>
+          <w:numId w:val="3"/>
+        </w:numPr>
+      </w:pPr>
+      <w:r>
+        <w:rPr>
+          <w:b/>
+          <w:bCs/>
+        </w:rPr>
+        <w:t xml:space="preserve">In-app</w:t>
+      </w:r>
+      <w:r>
+        <w:t xml:space="preserve">: Agent settings ⚙ → </w:t>
+      </w:r>
+      <w:r>
+        <w:rPr>
+          <w:b/>
+          <w:bCs/>
+        </w:rPr>
+        <w:t xml:space="preserve">Check now</w:t>
+      </w:r>
+      <w:r>
+        <w:t xml:space="preserve">. Downloads, installs, relaunches.</w:t>
+      </w:r>
+    </w:p>
+    <w:p>
+      <w:pPr>
+        <w:pStyle w:val="ListParagraph"/>
+        <w:numPr>
+          <w:ilvl w:val="0"/>
+          <w:numId w:val="3"/>
+        </w:numPr>
+      </w:pPr>
+      <w:r>
+        <w:rPr>
+          <w:b/>
+          <w:bCs/>
+        </w:rPr>
         <w:t xml:space="preserve">Manual</w:t>
       </w:r>
       <w:r>
@@ -4320,7 +4868,7 @@
         <w:pStyle w:val="Heading2"/>
       </w:pPr>
       <w:r>
-        <w:t xml:space="preserve">12. Troubleshooting</w:t>
+        <w:t xml:space="preserve">15. Troubleshooting</w:t>
       </w:r>
     </w:p>
     <w:p>
@@ -4386,26 +4934,6 @@
       </w:r>
       <w:r>
         <w:t xml:space="preserve">) at startup. If Ollama lives elsewhere, symlink it into one of those.</w:t>
-      </w:r>
-    </w:p>
-    <w:p>
-      <w:pPr>
-        <w:spacing w:after="120"/>
-      </w:pPr>
-      <w:r>
-        <w:rPr>
-          <w:b/>
-          <w:bCs/>
-        </w:rPr>
-        <w:t xml:space="preserve">Agent mode won't turn on / shows a backend error</w:t>
-      </w:r>
-    </w:p>
-    <w:p>
-      <w:pPr>
-        <w:spacing w:after="120"/>
-      </w:pPr>
-      <w:r>
-        <w:t xml:space="preserve">Agent mode runs on the Ollama and MLX backends only. If a Native model is loaded, switch to an Ollama or MLX model to use tools.</w:t>
       </w:r>
     </w:p>
     <w:p>

</xml_diff>

<commit_message>
Docs: present only Froglips's own native backend
Remove Ollama and MLX from README and the user guide as documented
backends — the "three backends" framing, the per-backend setup
sections, install prerequisites, and backend-specific troubleshooting.
Froglips ships its own built-in native in-process engine; the docs now
tell that single-backend story. The Ollama/MLX integrations remain in
the code, just no longer documented. Regenerated the .docx guide.
</commit_message>
<xml_diff>
--- a/docs/Froglips-User-Guide.docx
+++ b/docs/Froglips-User-Guide.docx
@@ -54,7 +54,7 @@
       <w:r>
         <w:t xml:space="preserve"> from the </w:t>
       </w:r>
-      <w:hyperlink w:history="1" r:id="rIdjiz4fhfg9hpdcpyh_gwkz">
+      <w:hyperlink w:history="1" r:id="rIdzauxtp6ptjhesrk1otquv">
         <w:r>
           <w:rPr>
             <w:rStyle w:val="Hyperlink"/>
@@ -238,38 +238,36 @@
         <w:spacing w:after="120"/>
       </w:pPr>
       <w:r>
-        <w:t xml:space="preserve">Froglips has three backends. </w:t>
-      </w:r>
-      <w:r>
-        <w:rPr>
-          <w:b/>
-          <w:bCs/>
-        </w:rPr>
-        <w:t xml:space="preserve">Native works out of the box — install nothing.</w:t>
-      </w:r>
-      <w:r>
-        <w:t xml:space="preserve"> The other two are opt-in.</w:t>
-      </w:r>
-    </w:p>
-    <w:p>
-      <w:pPr>
-        <w:pStyle w:val="Heading3"/>
-      </w:pPr>
-      <w:r>
-        <w:t xml:space="preserve">Native (recommended; zero install)</w:t>
-      </w:r>
-    </w:p>
-    <w:p>
-      <w:pPr>
-        <w:spacing w:after="120"/>
-      </w:pPr>
-      <w:r>
-        <w:t xml:space="preserve">No setup. Pick "⚡ Load a HuggingFace model natively…" from the model dropdown and enter a repo id (e.g. </w:t>
+        <w:rPr>
+          <w:b/>
+          <w:bCs/>
+        </w:rPr>
+        <w:t xml:space="preserve">Install nothing.</w:t>
+      </w:r>
+      <w:r>
+        <w:t xml:space="preserve"> Froglips ships its own native backend — an in-process engine (</w:t>
       </w:r>
       <w:r>
         <w:rPr>
           <w:rFonts w:ascii="Courier New" w:cs="Courier New" w:eastAsia="Courier New" w:hAnsi="Courier New"/>
         </w:rPr>
+        <w:t xml:space="preserve">mistralrs</w:t>
+      </w:r>
+      <w:r>
+        <w:t xml:space="preserve"> + candle + Metal kernels) that runs models directly on your hardware. There is no daemon to install, no Python to set up.</w:t>
+      </w:r>
+    </w:p>
+    <w:p>
+      <w:pPr>
+        <w:spacing w:after="120"/>
+      </w:pPr>
+      <w:r>
+        <w:t xml:space="preserve">Pick "⚡ Load a HuggingFace model natively…" from the model dropdown and enter a repo id (e.g. </w:t>
+      </w:r>
+      <w:r>
+        <w:rPr>
+          <w:rFonts w:ascii="Courier New" w:cs="Courier New" w:eastAsia="Courier New" w:hAnsi="Courier New"/>
+        </w:rPr>
         <w:t xml:space="preserve">NousResearch/Llama-3.2-1B</w:t>
       </w:r>
       <w:r>
@@ -282,41 +280,15 @@
         <w:t xml:space="preserve">~/.cache/huggingface/hub</w:t>
       </w:r>
       <w:r>
-        <w:t xml:space="preserve">; subsequent loads are instant. Runs in-process via embedded </w:t>
-      </w:r>
-      <w:r>
-        <w:rPr>
-          <w:rFonts w:ascii="Courier New" w:cs="Courier New" w:eastAsia="Courier New" w:hAnsi="Courier New"/>
-        </w:rPr>
-        <w:t xml:space="preserve">mistralrs</w:t>
-      </w:r>
-      <w:r>
-        <w:t xml:space="preserve"> + candle + Metal kernels.</w:t>
-      </w:r>
-    </w:p>
-    <w:p>
-      <w:pPr>
-        <w:pStyle w:val="Heading3"/>
-      </w:pPr>
-      <w:r>
-        <w:t xml:space="preserve">Ollama (optional — broader catalog + cloud routing)</w:t>
-      </w:r>
-    </w:p>
-    <w:p>
-      <w:pPr>
-        <w:spacing w:after="120"/>
-      </w:pPr>
-      <w:r>
-        <w:t xml:space="preserve">Install only if you want Ollama's local + </w:t>
-      </w:r>
-      <w:r>
-        <w:rPr>
-          <w:rFonts w:ascii="Courier New" w:cs="Courier New" w:eastAsia="Courier New" w:hAnsi="Courier New"/>
-        </w:rPr>
-        <w:t xml:space="preserve">:cloud</w:t>
-      </w:r>
-      <w:r>
-        <w:t xml:space="preserve"> model library or stronger tool-call support on some smaller models.</w:t>
+        <w:t xml:space="preserve">; subsequent loads are instant.</w:t>
+      </w:r>
+    </w:p>
+    <w:p>
+      <w:pPr>
+        <w:pStyle w:val="Heading2"/>
+      </w:pPr>
+      <w:r>
+        <w:t xml:space="preserve">3. First chat</w:t>
       </w:r>
     </w:p>
     <w:p>
@@ -328,7 +300,17 @@
         </w:numPr>
       </w:pPr>
       <w:r>
-        <w:t xml:space="preserve">Install from &lt;https://ollama.com&gt;</w:t>
+        <w:t xml:space="preserve">Click </w:t>
+      </w:r>
+      <w:r>
+        <w:rPr>
+          <w:b/>
+          <w:bCs/>
+        </w:rPr>
+        <w:t xml:space="preserve">+ New chat</w:t>
+      </w:r>
+      <w:r>
+        <w:t xml:space="preserve"> in the sidebar.</w:t>
       </w:r>
     </w:p>
     <w:p>
@@ -340,7 +322,14 @@
         </w:numPr>
       </w:pPr>
       <w:r>
-        <w:t xml:space="preserve">Start it: it lives in the menu bar</w:t>
+        <w:t xml:space="preserve">Click the model dropdown → </w:t>
+      </w:r>
+      <w:r>
+        <w:rPr>
+          <w:b/>
+          <w:bCs/>
+        </w:rPr>
+        <w:t xml:space="preserve">⚡ Load a HuggingFace model natively…</w:t>
       </w:r>
     </w:p>
     <w:p>
@@ -352,87 +341,26 @@
         </w:numPr>
       </w:pPr>
       <w:r>
-        <w:t xml:space="preserve">For cloud models: </w:t>
+        <w:t xml:space="preserve">Enter a small repo id, e.g. </w:t>
       </w:r>
       <w:r>
         <w:rPr>
           <w:rFonts w:ascii="Courier New" w:cs="Courier New" w:eastAsia="Courier New" w:hAnsi="Courier New"/>
         </w:rPr>
-        <w:t xml:space="preserve">ollama signin</w:t>
-      </w:r>
-    </w:p>
-    <w:p>
-      <w:pPr>
-        <w:pStyle w:val="Heading3"/>
-      </w:pPr>
-      <w:r>
-        <w:t xml:space="preserve">MLX (optional — Apple first-party inference via Python)</w:t>
-      </w:r>
-    </w:p>
-    <w:p>
-      <w:pPr>
-        <w:spacing w:after="120"/>
-      </w:pPr>
-      <w:r>
-        <w:t xml:space="preserve">Install only if you already use MLX models elsewhere. Froglips spawns </w:t>
-      </w:r>
-      <w:r>
-        <w:rPr>
-          <w:rFonts w:ascii="Courier New" w:cs="Courier New" w:eastAsia="Courier New" w:hAnsi="Courier New"/>
-        </w:rPr>
-        <w:t xml:space="preserve">mlx_lm.server</w:t>
-      </w:r>
-      <w:r>
-        <w:t xml:space="preserve"> automatically when you pick an MLX model.</w:t>
-      </w:r>
-    </w:p>
-    <w:p>
-      <w:pPr>
-        <w:shd w:fill="F2F2F2" w:color="auto" w:val="clear"/>
-        <w:spacing w:after="0" w:before="0"/>
-      </w:pPr>
-      <w:r>
-        <w:rPr>
-          <w:rFonts w:ascii="Courier New" w:cs="Courier New" w:eastAsia="Courier New" w:hAnsi="Courier New"/>
-          <w:sz w:val="19"/>
-          <w:szCs w:val="19"/>
-        </w:rPr>
-        <w:t xml:space="preserve">python3 -m venv ~/.venvs/mlx</w:t>
-      </w:r>
-    </w:p>
-    <w:p>
-      <w:pPr>
-        <w:shd w:fill="F2F2F2" w:color="auto" w:val="clear"/>
-        <w:spacing w:after="0" w:before="0"/>
-      </w:pPr>
-      <w:r>
-        <w:rPr>
-          <w:rFonts w:ascii="Courier New" w:cs="Courier New" w:eastAsia="Courier New" w:hAnsi="Courier New"/>
-          <w:sz w:val="19"/>
-          <w:szCs w:val="19"/>
-        </w:rPr>
-        <w:t xml:space="preserve">~/.venvs/mlx/bin/pip install mlx-lm</w:t>
-      </w:r>
-    </w:p>
-    <w:p>
-      <w:pPr>
-        <w:spacing w:after="80"/>
-      </w:pPr>
-    </w:p>
-    <w:p>
-      <w:pPr>
-        <w:pStyle w:val="Heading2"/>
-      </w:pPr>
-      <w:r>
-        <w:t xml:space="preserve">3. First chat</w:t>
-      </w:r>
-    </w:p>
-    <w:p>
-      <w:pPr>
-        <w:spacing w:after="120"/>
-      </w:pPr>
-      <w:r>
-        <w:t xml:space="preserve">Fastest path — Native, no install:</w:t>
+        <w:t xml:space="preserve">NousResearch/Llama-3.2-1B</w:t>
+      </w:r>
+      <w:r>
+        <w:t xml:space="preserve">. Click </w:t>
+      </w:r>
+      <w:r>
+        <w:rPr>
+          <w:b/>
+          <w:bCs/>
+        </w:rPr>
+        <w:t xml:space="preserve">Start</w:t>
+      </w:r>
+      <w:r>
+        <w:t xml:space="preserve">.</w:t>
       </w:r>
     </w:p>
     <w:p>
@@ -444,99 +372,23 @@
         </w:numPr>
       </w:pPr>
       <w:r>
-        <w:t xml:space="preserve">Click </w:t>
-      </w:r>
-      <w:r>
-        <w:rPr>
-          <w:b/>
-          <w:bCs/>
-        </w:rPr>
-        <w:t xml:space="preserve">+ New chat</w:t>
-      </w:r>
-      <w:r>
-        <w:t xml:space="preserve"> in the sidebar.</w:t>
-      </w:r>
-    </w:p>
-    <w:p>
-      <w:pPr>
-        <w:pStyle w:val="ListParagraph"/>
-        <w:numPr>
-          <w:ilvl w:val="0"/>
-          <w:numId w:val="2"/>
-        </w:numPr>
-      </w:pPr>
-      <w:r>
-        <w:t xml:space="preserve">Click the model dropdown → </w:t>
-      </w:r>
-      <w:r>
-        <w:rPr>
-          <w:b/>
-          <w:bCs/>
-        </w:rPr>
-        <w:t xml:space="preserve">⚡ Load a HuggingFace model natively…</w:t>
-      </w:r>
-    </w:p>
-    <w:p>
-      <w:pPr>
-        <w:pStyle w:val="ListParagraph"/>
-        <w:numPr>
-          <w:ilvl w:val="0"/>
-          <w:numId w:val="2"/>
-        </w:numPr>
-      </w:pPr>
-      <w:r>
-        <w:t xml:space="preserve">Enter a small repo id, e.g. </w:t>
-      </w:r>
-      <w:r>
-        <w:rPr>
-          <w:rFonts w:ascii="Courier New" w:cs="Courier New" w:eastAsia="Courier New" w:hAnsi="Courier New"/>
-        </w:rPr>
-        <w:t xml:space="preserve">NousResearch/Llama-3.2-1B</w:t>
-      </w:r>
-      <w:r>
-        <w:t xml:space="preserve">. Click </w:t>
-      </w:r>
-      <w:r>
-        <w:rPr>
-          <w:b/>
-          <w:bCs/>
-        </w:rPr>
-        <w:t xml:space="preserve">Start</w:t>
-      </w:r>
-      <w:r>
-        <w:t xml:space="preserve">.</w:t>
-      </w:r>
-    </w:p>
-    <w:p>
-      <w:pPr>
-        <w:pStyle w:val="ListParagraph"/>
-        <w:numPr>
-          <w:ilvl w:val="0"/>
-          <w:numId w:val="2"/>
-        </w:numPr>
-      </w:pPr>
-      <w:r>
         <w:t xml:space="preserve">First load downloads weights (~2 GB for 1B-class models) — a progress indicator tracks the download and model load. After that, type and hit Enter.</w:t>
       </w:r>
     </w:p>
     <w:p>
       <w:pPr>
-        <w:spacing w:after="120"/>
-      </w:pPr>
-      <w:r>
-        <w:t xml:space="preserve">If you installed Ollama instead:</w:t>
-      </w:r>
-    </w:p>
-    <w:p>
-      <w:pPr>
-        <w:pStyle w:val="ListParagraph"/>
-        <w:numPr>
-          <w:ilvl w:val="0"/>
-          <w:numId w:val="2"/>
-        </w:numPr>
-      </w:pPr>
-      <w:r>
-        <w:t xml:space="preserve">Model dropdown → </w:t>
+        <w:pStyle w:val="Heading2"/>
+      </w:pPr>
+      <w:r>
+        <w:t xml:space="preserve">4. The Model Library</w:t>
+      </w:r>
+    </w:p>
+    <w:p>
+      <w:pPr>
+        <w:spacing w:after="120"/>
+      </w:pPr>
+      <w:r>
+        <w:t xml:space="preserve">Open with </w:t>
       </w:r>
       <w:r>
         <w:rPr>
@@ -546,7 +398,7 @@
         <w:t xml:space="preserve">Browse &amp; download models…</w:t>
       </w:r>
       <w:r>
-        <w:t xml:space="preserve"> → set </w:t>
+        <w:t xml:space="preserve"> from the model dropdown. A </w:t>
       </w:r>
       <w:r>
         <w:rPr>
@@ -555,121 +407,13 @@
         </w:rPr>
         <w:t xml:space="preserve">Source</w:t>
       </w:r>
-      <w:r>
-        <w:t xml:space="preserve"> to </w:t>
-      </w:r>
-      <w:r>
-        <w:rPr>
-          <w:b/>
-          <w:bCs/>
-        </w:rPr>
-        <w:t xml:space="preserve">Ollama</w:t>
-      </w:r>
-      <w:r>
-        <w:t xml:space="preserve">.</w:t>
-      </w:r>
-    </w:p>
-    <w:p>
-      <w:pPr>
-        <w:pStyle w:val="ListParagraph"/>
-        <w:numPr>
-          <w:ilvl w:val="0"/>
-          <w:numId w:val="2"/>
-        </w:numPr>
-      </w:pPr>
-      <w:r>
-        <w:t xml:space="preserve">Pick something small like </w:t>
-      </w:r>
-      <w:r>
-        <w:rPr>
-          <w:rFonts w:ascii="Courier New" w:cs="Courier New" w:eastAsia="Courier New" w:hAnsi="Courier New"/>
-        </w:rPr>
-        <w:t xml:space="preserve">llama3.2:3b</w:t>
-      </w:r>
-      <w:r>
-        <w:t xml:space="preserve"> or </w:t>
-      </w:r>
-      <w:r>
-        <w:rPr>
-          <w:rFonts w:ascii="Courier New" w:cs="Courier New" w:eastAsia="Courier New" w:hAnsi="Courier New"/>
-        </w:rPr>
-        <w:t xml:space="preserve">qwen3:4b</w:t>
-      </w:r>
-      <w:r>
-        <w:t xml:space="preserve">. Click </w:t>
-      </w:r>
-      <w:r>
-        <w:rPr>
-          <w:b/>
-          <w:bCs/>
-        </w:rPr>
-        <w:t xml:space="preserve">Pull</w:t>
-      </w:r>
-      <w:r>
-        <w:t xml:space="preserve">.</w:t>
-      </w:r>
-    </w:p>
-    <w:p>
-      <w:pPr>
-        <w:pStyle w:val="ListParagraph"/>
-        <w:numPr>
-          <w:ilvl w:val="0"/>
-          <w:numId w:val="2"/>
-        </w:numPr>
-      </w:pPr>
-      <w:r>
-        <w:t xml:space="preserve">Close the library; the model appears in the dropdown. Pick it → </w:t>
-      </w:r>
-      <w:r>
-        <w:rPr>
-          <w:b/>
-          <w:bCs/>
-        </w:rPr>
-        <w:t xml:space="preserve">Start</w:t>
-      </w:r>
-      <w:r>
-        <w:t xml:space="preserve"> → chat.</w:t>
-      </w:r>
-    </w:p>
-    <w:p>
-      <w:pPr>
-        <w:pStyle w:val="Heading2"/>
-      </w:pPr>
-      <w:r>
-        <w:t xml:space="preserve">4. The Model Library</w:t>
-      </w:r>
-    </w:p>
-    <w:p>
-      <w:pPr>
-        <w:spacing w:after="120"/>
-      </w:pPr>
-      <w:r>
-        <w:t xml:space="preserve">Open with </w:t>
-      </w:r>
-      <w:r>
-        <w:rPr>
-          <w:b/>
-          <w:bCs/>
-        </w:rPr>
-        <w:t xml:space="preserve">Browse &amp; download models…</w:t>
-      </w:r>
-      <w:r>
-        <w:t xml:space="preserve"> from the model dropdown. A </w:t>
-      </w:r>
-      <w:r>
-        <w:rPr>
-          <w:b/>
-          <w:bCs/>
-        </w:rPr>
-        <w:t xml:space="preserve">Source</w:t>
-      </w:r>
-    </w:p>
-    <w:p>
-      <w:pPr>
-        <w:spacing w:after="120"/>
-      </w:pPr>
-      <w:r>
-        <w:t xml:space="preserve">selector at the top switches between five views:</w:t>
+    </w:p>
+    <w:p>
+      <w:pPr>
+        <w:spacing w:after="120"/>
+      </w:pPr>
+      <w:r>
+        <w:t xml:space="preserve">selector at the top switches between views:</w:t>
       </w:r>
     </w:p>
     <w:tbl>
@@ -768,7 +512,7 @@
           </w:tcPr>
           <w:p>
             <w:r>
-              <w:t xml:space="preserve">Everything currently pulled — Ollama, MLX, and GGUF models, with sizes and a </w:t>
+              <w:t xml:space="preserve">Everything currently downloaded, with sizes and a </w:t>
             </w:r>
             <w:r>
               <w:rPr>
@@ -800,89 +544,32 @@
                 <w:b/>
                 <w:bCs/>
               </w:rPr>
-              <w:t xml:space="preserve">Ollama</w:t>
-            </w:r>
-          </w:p>
-        </w:tc>
-        <w:tc>
-          <w:tcPr>
-            <w:tcW w:type="dxa" w:w="4680"/>
-            <w:tcMar>
-              <w:top w:type="dxa" w:w="80"/>
-              <w:left w:type="dxa" w:w="120"/>
-              <w:bottom w:type="dxa" w:w="80"/>
-              <w:right w:type="dxa" w:w="120"/>
-            </w:tcMar>
-          </w:tcPr>
-          <w:p>
-            <w:r>
-              <w:t xml:space="preserve">Full </w:t>
+              <w:t xml:space="preserve">HuggingFace</w:t>
+            </w:r>
+          </w:p>
+        </w:tc>
+        <w:tc>
+          <w:tcPr>
+            <w:tcW w:type="dxa" w:w="4680"/>
+            <w:tcMar>
+              <w:top w:type="dxa" w:w="80"/>
+              <w:left w:type="dxa" w:w="120"/>
+              <w:bottom w:type="dxa" w:w="80"/>
+              <w:right w:type="dxa" w:w="120"/>
+            </w:tcMar>
+          </w:tcPr>
+          <w:p>
+            <w:r>
+              <w:t xml:space="preserve">Live </w:t>
             </w:r>
             <w:r>
               <w:rPr>
                 <w:rFonts w:ascii="Courier New" w:cs="Courier New" w:eastAsia="Courier New" w:hAnsi="Courier New"/>
               </w:rPr>
-              <w:t xml:space="preserve">ollama.com/library</w:t>
-            </w:r>
-            <w:r>
-              <w:t xml:space="preserve"> view: per-model description, colored capability chips (vision / tools / thinking / audio / cloud / embedding), pull counts and relative-updated metadata. Filter chips and a Popular/Newest/Updated sort. Falls back to a curated catalog with a banner if the live page can't be scraped.</w:t>
-            </w:r>
-          </w:p>
-        </w:tc>
-      </w:tr>
-      <w:tr>
-        <w:tc>
-          <w:tcPr>
-            <w:tcW w:type="dxa" w:w="4680"/>
-            <w:tcMar>
-              <w:top w:type="dxa" w:w="80"/>
-              <w:left w:type="dxa" w:w="120"/>
-              <w:bottom w:type="dxa" w:w="80"/>
-              <w:right w:type="dxa" w:w="120"/>
-            </w:tcMar>
-          </w:tcPr>
-          <w:p>
-            <w:r>
-              <w:rPr>
-                <w:b/>
-                <w:bCs/>
-              </w:rPr>
-              <w:t xml:space="preserve">HuggingFace</w:t>
-            </w:r>
-          </w:p>
-        </w:tc>
-        <w:tc>
-          <w:tcPr>
-            <w:tcW w:type="dxa" w:w="4680"/>
-            <w:tcMar>
-              <w:top w:type="dxa" w:w="80"/>
-              <w:left w:type="dxa" w:w="120"/>
-              <w:bottom w:type="dxa" w:w="80"/>
-              <w:right w:type="dxa" w:w="120"/>
-            </w:tcMar>
-          </w:tcPr>
-          <w:p>
-            <w:r>
-              <w:t xml:space="preserve">Live </w:t>
-            </w:r>
-            <w:r>
-              <w:rPr>
-                <w:rFonts w:ascii="Courier New" w:cs="Courier New" w:eastAsia="Courier New" w:hAnsi="Courier New"/>
-              </w:rPr>
               <w:t xml:space="preserve">huggingface.co/models</w:t>
             </w:r>
             <w:r>
-              <w:t xml:space="preserve"> view with a collapsible filter sidebar (tasks, parameter range, libraries, apps, inference providers), live total count, name filter, and sort. The action button auto-routes: MLX repos → </w:t>
-            </w:r>
-            <w:r>
-              <w:rPr>
-                <w:b/>
-                <w:bCs/>
-              </w:rPr>
-              <w:t xml:space="preserve">Pull</w:t>
-            </w:r>
-            <w:r>
-              <w:t xml:space="preserve">, GGUF repos → </w:t>
+              <w:t xml:space="preserve"> view with a collapsible filter sidebar (tasks, parameter range, libraries, apps, inference providers), live total count, name filter, and sort. The action button auto-routes: GGUF repos → </w:t>
             </w:r>
             <w:r>
               <w:rPr>
@@ -1041,7 +728,7 @@
         <w:t xml:space="preserve">Inline:</w:t>
       </w:r>
       <w:r>
-        <w:t xml:space="preserve"> on the Ollama / HuggingFace / RP views, any model that's already pulled shows a red </w:t>
+        <w:t xml:space="preserve"> on the HuggingFace / RP views, any model that's already downloaded shows a red </w:t>
       </w:r>
       <w:r>
         <w:rPr>
@@ -1331,7 +1018,7 @@
         <w:t xml:space="preserve">nomic-embed-text</w:t>
       </w:r>
       <w:r>
-        <w:t xml:space="preserve"> (via Ollama), looks for memories with cosine similarity &gt; 0.55, and injects up to 5 into the system prompt as a </w:t>
+        <w:t xml:space="preserve">, looks for memories with cosine similarity &gt; 0.55, and injects up to 5 into the system prompt as a </w:t>
       </w:r>
       <w:r>
         <w:rPr>
@@ -1479,23 +1166,23 @@
         <w:t xml:space="preserve">Agent</w:t>
       </w:r>
       <w:r>
-        <w:t xml:space="preserve"> button next to the chat input. **Agent mode works on all</w:t>
-      </w:r>
-    </w:p>
-    <w:p>
-      <w:pPr>
-        <w:spacing w:after="120"/>
-      </w:pPr>
-      <w:r>
-        <w:t xml:space="preserve">three backends — Ollama, MLX, and Native.** (Earlier versions limited it to</w:t>
-      </w:r>
-    </w:p>
-    <w:p>
-      <w:pPr>
-        <w:spacing w:after="120"/>
-      </w:pPr>
-      <w:r>
-        <w:t xml:space="preserve">Ollama and MLX; the Native backend now supports tool-calling too.)</w:t>
+        <w:t xml:space="preserve"> button next to the chat input. Agent mode runs on</w:t>
+      </w:r>
+    </w:p>
+    <w:p>
+      <w:pPr>
+        <w:spacing w:after="120"/>
+      </w:pPr>
+      <w:r>
+        <w:t xml:space="preserve">Froglips's built-in native backend — any model you load supports the</w:t>
+      </w:r>
+    </w:p>
+    <w:p>
+      <w:pPr>
+        <w:spacing w:after="120"/>
+      </w:pPr>
+      <w:r>
+        <w:t xml:space="preserve">tool-calling loop.</w:t>
       </w:r>
     </w:p>
     <w:p>
@@ -4116,7 +3803,7 @@
         <w:spacing w:after="120"/>
       </w:pPr>
       <w:r>
-        <w:t xml:space="preserve">backend default, exactly as before. Parameters apply on all three backends.</w:t>
+        <w:t xml:space="preserve">backend default, exactly as before.</w:t>
       </w:r>
     </w:p>
     <w:p>
@@ -4880,118 +4567,54 @@
           <w:b/>
           <w:bCs/>
         </w:rPr>
-        <w:t xml:space="preserve">"Ollama: ollama not found on PATH"</w:t>
-      </w:r>
-    </w:p>
-    <w:p>
-      <w:pPr>
-        <w:spacing w:after="120"/>
-      </w:pPr>
-      <w:r>
-        <w:t xml:space="preserve">The app prepends common bin dirs (</w:t>
+        <w:t xml:space="preserve">Model picker shows nothing</w:t>
+      </w:r>
+    </w:p>
+    <w:p>
+      <w:pPr>
+        <w:spacing w:after="120"/>
+      </w:pPr>
+      <w:r>
+        <w:t xml:space="preserve">Load a model first: model dropdown → </w:t>
+      </w:r>
+      <w:r>
+        <w:rPr>
+          <w:b/>
+          <w:bCs/>
+        </w:rPr>
+        <w:t xml:space="preserve">⚡ Load a HuggingFace model natively…</w:t>
+      </w:r>
+      <w:r>
+        <w:t xml:space="preserve"> and enter a repo id. Until a model has finished loading, the picker has nothing to show.</w:t>
+      </w:r>
+    </w:p>
+    <w:p>
+      <w:pPr>
+        <w:spacing w:after="120"/>
+      </w:pPr>
+      <w:r>
+        <w:rPr>
+          <w:b/>
+          <w:bCs/>
+        </w:rPr>
+        <w:t xml:space="preserve">Model fails to load</w:t>
+      </w:r>
+    </w:p>
+    <w:p>
+      <w:pPr>
+        <w:spacing w:after="120"/>
+      </w:pPr>
+      <w:r>
+        <w:t xml:space="preserve">First loads download weights from HuggingFace into </w:t>
       </w:r>
       <w:r>
         <w:rPr>
           <w:rFonts w:ascii="Courier New" w:cs="Courier New" w:eastAsia="Courier New" w:hAnsi="Courier New"/>
         </w:rPr>
-        <w:t xml:space="preserve">/usr/local/bin</w:t>
-      </w:r>
-      <w:r>
-        <w:t xml:space="preserve">, </w:t>
-      </w:r>
-      <w:r>
-        <w:rPr>
-          <w:rFonts w:ascii="Courier New" w:cs="Courier New" w:eastAsia="Courier New" w:hAnsi="Courier New"/>
-        </w:rPr>
-        <w:t xml:space="preserve">/opt/homebrew/bin</w:t>
-      </w:r>
-      <w:r>
-        <w:t xml:space="preserve">, </w:t>
-      </w:r>
-      <w:r>
-        <w:rPr>
-          <w:rFonts w:ascii="Courier New" w:cs="Courier New" w:eastAsia="Courier New" w:hAnsi="Courier New"/>
-        </w:rPr>
-        <w:t xml:space="preserve">~/.local/bin</w:t>
-      </w:r>
-      <w:r>
-        <w:t xml:space="preserve">, </w:t>
-      </w:r>
-      <w:r>
-        <w:rPr>
-          <w:rFonts w:ascii="Courier New" w:cs="Courier New" w:eastAsia="Courier New" w:hAnsi="Courier New"/>
-        </w:rPr>
-        <w:t xml:space="preserve">~/.cargo/bin</w:t>
-      </w:r>
-      <w:r>
-        <w:t xml:space="preserve">, </w:t>
-      </w:r>
-      <w:r>
-        <w:rPr>
-          <w:rFonts w:ascii="Courier New" w:cs="Courier New" w:eastAsia="Courier New" w:hAnsi="Courier New"/>
-        </w:rPr>
-        <w:t xml:space="preserve">~/.venvs/mlx/bin</w:t>
-      </w:r>
-      <w:r>
-        <w:t xml:space="preserve">) at startup. If Ollama lives elsewhere, symlink it into one of those.</w:t>
-      </w:r>
-    </w:p>
-    <w:p>
-      <w:pPr>
-        <w:spacing w:after="120"/>
-      </w:pPr>
-      <w:r>
-        <w:rPr>
-          <w:b/>
-          <w:bCs/>
-        </w:rPr>
-        <w:t xml:space="preserve">Model picker shows nothing</w:t>
-      </w:r>
-    </w:p>
-    <w:p>
-      <w:pPr>
-        <w:spacing w:after="120"/>
-      </w:pPr>
-      <w:r>
-        <w:t xml:space="preserve">Make sure Ollama is actually running (menu bar icon). For MLX, ensure </w:t>
-      </w:r>
-      <w:r>
-        <w:rPr>
-          <w:rFonts w:ascii="Courier New" w:cs="Courier New" w:eastAsia="Courier New" w:hAnsi="Courier New"/>
-        </w:rPr>
-        <w:t xml:space="preserve">~/.venvs/mlx/bin/mlx_lm.server</w:t>
-      </w:r>
-      <w:r>
-        <w:t xml:space="preserve"> exists.</w:t>
-      </w:r>
-    </w:p>
-    <w:p>
-      <w:pPr>
-        <w:spacing w:after="120"/>
-      </w:pPr>
-      <w:r>
-        <w:rPr>
-          <w:b/>
-          <w:bCs/>
-        </w:rPr>
-        <w:t xml:space="preserve">Cloud model 500s</w:t>
-      </w:r>
-    </w:p>
-    <w:p>
-      <w:pPr>
-        <w:spacing w:after="120"/>
-      </w:pPr>
-      <w:r>
-        <w:t xml:space="preserve">Ollama cloud has occasional outages. Check </w:t>
-      </w:r>
-      <w:r>
-        <w:rPr>
-          <w:rFonts w:ascii="Courier New" w:cs="Courier New" w:eastAsia="Courier New" w:hAnsi="Courier New"/>
-        </w:rPr>
-        <w:t xml:space="preserve">curl -s http://localhost:11434/api/chat -d '{"model":"&lt;name&gt;","messages":[{"role":"user","content":"hi"}],"stream":false}'</w:t>
-      </w:r>
-      <w:r>
-        <w:t xml:space="preserve"> to confirm it's an upstream issue.</w:t>
+        <w:t xml:space="preserve">~/.cache/huggingface/hub</w:t>
+      </w:r>
+      <w:r>
+        <w:t xml:space="preserve">; a slow or interrupted download is the usual cause. Retry the load — completed shards are reused. Very large models may exceed available memory; try a smaller repo.</w:t>
       </w:r>
     </w:p>
     <w:p>

</xml_diff>